<commit_message>
docs: ajustar estilo del v10 al del PDF v9 (sin anglicismos ni jerga técnica)
- Reescribe las secciones nuevas 22-28 y las ampliaciones a las
  secciones 5-10, 14, 20, 29-30 con frases nominales sucintas en
  español puro
- Reemplaza términos técnicos por sus equivalentes funcionales
  (modal → ventana dentro de la aplicación; login → inicio de
  sesión; stack → tecnologías; claim → reclamo; etc.)
- Elimina referencias a nombres de frameworks, librerías y
  componentes (Next.js, jsbarcode, DriverPresenceMap, etc.)
- Reduce el uso de negrita a términos clave puntuales
- Quita las marcas "(NUEVO)" de los títulos de sección
- Elimina el subtítulo de versión

Co-Authored-By: Claude Opus 4.7 <noreply@anthropic.com>
</commit_message>
<xml_diff>
--- a/docs/FUNCIONALIDADES_PLATAFORMA_v10.docx
+++ b/docs/FUNCIONALIDADES_PLATAFORMA_v10.docx
@@ -18,20 +18,6 @@
     </w:p>
     <w:p>
       <w:pPr>
-        <w:spacing w:before="0" w:after="360"/>
-        <w:jc w:val="center"/>
-      </w:pPr>
-      <w:r>
-        <w:rPr>
-          <w:i/>
-          <w:color w:val="64748B"/>
-          <w:sz w:val="22"/>
-        </w:rPr>
-        <w:t>v10 — Actualización con módulos implementados recientemente</w:t>
-      </w:r>
-    </w:p>
-    <w:p>
-      <w:pPr>
         <w:spacing w:before="280" w:after="80"/>
       </w:pPr>
       <w:r>
@@ -1016,22 +1002,7 @@
           <w:rFonts w:ascii="Calibri" w:hAnsi="Calibri"/>
           <w:sz w:val="22"/>
         </w:rPr>
-        <w:t xml:space="preserve">Credencial digital con código QR accesible como </w:t>
-      </w:r>
-      <w:r>
-        <w:rPr>
-          <w:rFonts w:ascii="Calibri" w:hAnsi="Calibri"/>
-          <w:b/>
-          <w:sz w:val="22"/>
-        </w:rPr>
-        <w:t>modal embebido en el portal</w:t>
-      </w:r>
-      <w:r>
-        <w:rPr>
-          <w:rFonts w:ascii="Calibri" w:hAnsi="Calibri"/>
-          <w:sz w:val="22"/>
-        </w:rPr>
-        <w:t xml:space="preserve"> (sin abrir ventana adicional), con opción de imprimir desde el mismo flujo.</w:t>
+        <w:t>Visualización de la credencial digital con código QR dentro de la propia aplicación, sin necesidad de abrir una ventana adicional, con opción de imprimirla desde la misma vista.</w:t>
       </w:r>
     </w:p>
     <w:p>
@@ -1112,7 +1083,7 @@
           <w:color w:val="334155"/>
           <w:sz w:val="22"/>
         </w:rPr>
-        <w:t>Aplicación destinada a participantes registrados como tipo de cliente VIP, mediante la cual pueden solicitar de forma autónoma los servicios de transporte que requieran durante su estadía. El portal incorpora además las pestañas operativas de Premiaciones, Cupones y Alimentación, garantizando paridad funcional con los portales de atleta y jefe de delegación.</w:t>
+        <w:t>Aplicación destinada a participantes registrados como tipo de cliente VIP, mediante la cual pueden solicitar de forma autónoma los servicios de transporte que requieran durante su estadía. El portal incorpora además las secciones operativas de premiaciones, cupones y alimentación, garantizando paridad funcional con los portales del jefe de delegación y del atleta.</w:t>
       </w:r>
     </w:p>
     <w:p>
@@ -1221,83 +1192,51 @@
       <w:r>
         <w:rPr>
           <w:rFonts w:ascii="Calibri" w:hAnsi="Calibri"/>
-          <w:b/>
-          <w:sz w:val="22"/>
-        </w:rPr>
-        <w:t>Pestaña Premiaciones</w:t>
-      </w:r>
-      <w:r>
-        <w:rPr>
-          <w:rFonts w:ascii="Calibri" w:hAnsi="Calibri"/>
-          <w:sz w:val="22"/>
-        </w:rPr>
-        <w:t xml:space="preserve"> con header dorado, indicadores (Programadas / Realizadas / Confirmadas / Pendientes), vista calendario con marcadores por día y vista lista intercambiables, filtros por estado/rol/asistencia y CTAs para confirmar o declinar la asistencia a cada ceremonia.</w:t>
-      </w:r>
-    </w:p>
-    <w:p>
-      <w:pPr>
-        <w:pStyle w:val="ListBullet"/>
-        <w:spacing w:before="0" w:after="40"/>
-        <w:ind w:left="340"/>
-      </w:pPr>
-      <w:r>
-        <w:rPr>
-          <w:rFonts w:ascii="Calibri" w:hAnsi="Calibri"/>
-          <w:b/>
-          <w:sz w:val="22"/>
-        </w:rPr>
-        <w:t>Pestaña Cupones</w:t>
-      </w:r>
-      <w:r>
-        <w:rPr>
-          <w:rFonts w:ascii="Calibri" w:hAnsi="Calibri"/>
-          <w:sz w:val="22"/>
-        </w:rPr>
-        <w:t xml:space="preserve"> con sub-pestañas Disponibles / Mis cupones, catálogo de beneficios del evento, reclamo de cupón y modal con QR + código de respaldo para canje en el comercio.</w:t>
-      </w:r>
-    </w:p>
-    <w:p>
-      <w:pPr>
-        <w:pStyle w:val="ListBullet"/>
-        <w:spacing w:before="0" w:after="40"/>
-        <w:ind w:left="340"/>
-      </w:pPr>
-      <w:r>
-        <w:rPr>
-          <w:rFonts w:ascii="Calibri" w:hAnsi="Calibri"/>
-          <w:b/>
-          <w:sz w:val="22"/>
-        </w:rPr>
-        <w:t>Pestaña Comida</w:t>
-      </w:r>
-      <w:r>
-        <w:rPr>
-          <w:rFonts w:ascii="Calibri" w:hAnsi="Calibri"/>
-          <w:sz w:val="22"/>
-        </w:rPr>
-        <w:t xml:space="preserve"> con menú de hoy, menú de mañana y lugares de comida del evento (sin filtros por tipo de cliente).</w:t>
-      </w:r>
-    </w:p>
-    <w:p>
-      <w:pPr>
-        <w:pStyle w:val="ListBullet"/>
-        <w:spacing w:before="0" w:after="40"/>
-        <w:ind w:left="340"/>
-      </w:pPr>
-      <w:r>
-        <w:rPr>
-          <w:rFonts w:ascii="Calibri" w:hAnsi="Calibri"/>
-          <w:b/>
-          <w:sz w:val="22"/>
-        </w:rPr>
-        <w:t>Credencial digital</w:t>
-      </w:r>
-      <w:r>
-        <w:rPr>
-          <w:rFonts w:ascii="Calibri" w:hAnsi="Calibri"/>
-          <w:sz w:val="22"/>
-        </w:rPr>
-        <w:t xml:space="preserve"> accesible como modal inline (iframe dentro del portal) con opción de imprimir.</w:t>
+          <w:sz w:val="22"/>
+        </w:rPr>
+        <w:t>Sección de premiaciones con indicadores agregados (programadas, realizadas, confirmadas, pendientes), vista de calendario mensual con marcadores en los días que tienen ceremonias y vista de lista intercambiables, filtros por estado, rol y asistencia, y opción de confirmar o declinar la asistencia a cada ceremonia.</w:t>
+      </w:r>
+    </w:p>
+    <w:p>
+      <w:pPr>
+        <w:pStyle w:val="ListBullet"/>
+        <w:spacing w:before="0" w:after="40"/>
+        <w:ind w:left="340"/>
+      </w:pPr>
+      <w:r>
+        <w:rPr>
+          <w:rFonts w:ascii="Calibri" w:hAnsi="Calibri"/>
+          <w:sz w:val="22"/>
+        </w:rPr>
+        <w:t>Sección de cupones con dos vistas, disponibles y mis cupones, catálogo de beneficios del evento, reclamo del cupón y visualización del código QR con código de respaldo para el canje en el comercio.</w:t>
+      </w:r>
+    </w:p>
+    <w:p>
+      <w:pPr>
+        <w:pStyle w:val="ListBullet"/>
+        <w:spacing w:before="0" w:after="40"/>
+        <w:ind w:left="340"/>
+      </w:pPr>
+      <w:r>
+        <w:rPr>
+          <w:rFonts w:ascii="Calibri" w:hAnsi="Calibri"/>
+          <w:sz w:val="22"/>
+        </w:rPr>
+        <w:t>Sección de alimentación con el menú de hoy, el menú de mañana y los lugares de comida del evento, sin filtros por tipo de cliente.</w:t>
+      </w:r>
+    </w:p>
+    <w:p>
+      <w:pPr>
+        <w:pStyle w:val="ListBullet"/>
+        <w:spacing w:before="0" w:after="40"/>
+        <w:ind w:left="340"/>
+      </w:pPr>
+      <w:r>
+        <w:rPr>
+          <w:rFonts w:ascii="Calibri" w:hAnsi="Calibri"/>
+          <w:sz w:val="22"/>
+        </w:rPr>
+        <w:t>Visualización de la credencial digital dentro de la propia aplicación, sin necesidad de abrir una ventana adicional, con opción de imprimirla desde la misma vista.</w:t>
       </w:r>
     </w:p>
     <w:p>
@@ -1461,117 +1400,63 @@
           <w:rFonts w:ascii="Calibri" w:hAnsi="Calibri"/>
           <w:sz w:val="22"/>
         </w:rPr>
-        <w:t xml:space="preserve">Acceso a las secciones operativas del portal: Itinerario, Actividades, Calendario, Sedes, Alimentación, </w:t>
-      </w:r>
-      <w:r>
-        <w:rPr>
-          <w:rFonts w:ascii="Calibri" w:hAnsi="Calibri"/>
-          <w:b/>
-          <w:sz w:val="22"/>
-        </w:rPr>
-        <w:t>Premiaciones</w:t>
-      </w:r>
-      <w:r>
-        <w:rPr>
-          <w:rFonts w:ascii="Calibri" w:hAnsi="Calibri"/>
-          <w:sz w:val="22"/>
-        </w:rPr>
-        <w:t xml:space="preserve">, </w:t>
-      </w:r>
-      <w:r>
-        <w:rPr>
-          <w:rFonts w:ascii="Calibri" w:hAnsi="Calibri"/>
-          <w:b/>
-          <w:sz w:val="22"/>
-        </w:rPr>
-        <w:t>Cupones</w:t>
-      </w:r>
-      <w:r>
-        <w:rPr>
-          <w:rFonts w:ascii="Calibri" w:hAnsi="Calibri"/>
-          <w:sz w:val="22"/>
-        </w:rPr>
-        <w:t>, Delegación y Cuenta.</w:t>
-      </w:r>
-    </w:p>
-    <w:p>
-      <w:pPr>
-        <w:pStyle w:val="ListBullet"/>
-        <w:spacing w:before="0" w:after="40"/>
-        <w:ind w:left="340"/>
-      </w:pPr>
-      <w:r>
-        <w:rPr>
-          <w:rFonts w:ascii="Calibri" w:hAnsi="Calibri"/>
-          <w:b/>
-          <w:sz w:val="22"/>
-        </w:rPr>
-        <w:t>Pestaña Premiaciones</w:t>
-      </w:r>
-      <w:r>
-        <w:rPr>
-          <w:rFonts w:ascii="Calibri" w:hAnsi="Calibri"/>
-          <w:sz w:val="22"/>
-        </w:rPr>
-        <w:t xml:space="preserve"> con vista calendario + vista lista intercambiables, filtros (estado, disciplina, sede, búsqueda), agrupación por día con headers sticky y resumen de entregadores por rol (Oro/Plata/Bronce/Autoridad/Premiador).</w:t>
-      </w:r>
-    </w:p>
-    <w:p>
-      <w:pPr>
-        <w:pStyle w:val="ListBullet"/>
-        <w:spacing w:before="0" w:after="40"/>
-        <w:ind w:left="340"/>
-      </w:pPr>
-      <w:r>
-        <w:rPr>
-          <w:rFonts w:ascii="Calibri" w:hAnsi="Calibri"/>
-          <w:b/>
-          <w:sz w:val="22"/>
-        </w:rPr>
-        <w:t>Pestaña Cupones</w:t>
-      </w:r>
-      <w:r>
-        <w:rPr>
-          <w:rFonts w:ascii="Calibri" w:hAnsi="Calibri"/>
-          <w:sz w:val="22"/>
-        </w:rPr>
-        <w:t xml:space="preserve"> con catálogo completo y reclamo de QR sin requerir login adicional.</w:t>
-      </w:r>
-    </w:p>
-    <w:p>
-      <w:pPr>
-        <w:pStyle w:val="ListBullet"/>
-        <w:spacing w:before="0" w:after="40"/>
-        <w:ind w:left="340"/>
-      </w:pPr>
-      <w:r>
-        <w:rPr>
-          <w:rFonts w:ascii="Calibri" w:hAnsi="Calibri"/>
-          <w:b/>
-          <w:sz w:val="22"/>
-        </w:rPr>
-        <w:t>Alimentación sin filtros por tipo de cliente</w:t>
-      </w:r>
-      <w:r>
-        <w:rPr>
-          <w:rFonts w:ascii="Calibri" w:hAnsi="Calibri"/>
-          <w:sz w:val="22"/>
-        </w:rPr>
-        <w:t>: ahora todos los miembros de la delegación pueden consultar la oferta completa.</w:t>
-      </w:r>
-    </w:p>
-    <w:p>
-      <w:pPr>
-        <w:pStyle w:val="ListBullet"/>
-        <w:spacing w:before="0" w:after="40"/>
-        <w:ind w:left="340"/>
-      </w:pPr>
-      <w:r>
-        <w:rPr>
-          <w:rFonts w:ascii="Calibri" w:hAnsi="Calibri"/>
-          <w:sz w:val="22"/>
-        </w:rPr>
-        <w:t>Credencial digital como modal inline dentro del portal.</w:t>
+        <w:t>Acceso a las secciones operativas del portal: itinerario, actividades, calendario, sedes, alimentación, premiaciones, cupones, delegación y cuenta.</w:t>
+      </w:r>
+    </w:p>
+    <w:p>
+      <w:pPr>
+        <w:pStyle w:val="ListBullet"/>
+        <w:spacing w:before="0" w:after="40"/>
+        <w:ind w:left="340"/>
+      </w:pPr>
+      <w:r>
+        <w:rPr>
+          <w:rFonts w:ascii="Calibri" w:hAnsi="Calibri"/>
+          <w:sz w:val="22"/>
+        </w:rPr>
+        <w:t>Sección de premiaciones con vista de calendario mensual y vista de lista intercambiables, filtros por estado, disciplina, sede y búsqueda libre, agrupación por día y resumen de entregadores por rol (oro, plata, bronce, autoridad y premiador).</w:t>
+      </w:r>
+    </w:p>
+    <w:p>
+      <w:pPr>
+        <w:pStyle w:val="ListBullet"/>
+        <w:spacing w:before="0" w:after="40"/>
+        <w:ind w:left="340"/>
+      </w:pPr>
+      <w:r>
+        <w:rPr>
+          <w:rFonts w:ascii="Calibri" w:hAnsi="Calibri"/>
+          <w:sz w:val="22"/>
+        </w:rPr>
+        <w:t>Sección de cupones con catálogo completo y reclamo del código QR sin requerir inicio de sesión adicional.</w:t>
+      </w:r>
+    </w:p>
+    <w:p>
+      <w:pPr>
+        <w:pStyle w:val="ListBullet"/>
+        <w:spacing w:before="0" w:after="40"/>
+        <w:ind w:left="340"/>
+      </w:pPr>
+      <w:r>
+        <w:rPr>
+          <w:rFonts w:ascii="Calibri" w:hAnsi="Calibri"/>
+          <w:sz w:val="22"/>
+        </w:rPr>
+        <w:t>Visualización de la alimentación sin filtros por tipo de cliente: todos los miembros de la delegación pueden consultar la oferta completa de menús y lugares de comida.</w:t>
+      </w:r>
+    </w:p>
+    <w:p>
+      <w:pPr>
+        <w:pStyle w:val="ListBullet"/>
+        <w:spacing w:before="0" w:after="40"/>
+        <w:ind w:left="340"/>
+      </w:pPr>
+      <w:r>
+        <w:rPr>
+          <w:rFonts w:ascii="Calibri" w:hAnsi="Calibri"/>
+          <w:sz w:val="22"/>
+        </w:rPr>
+        <w:t>Visualización de la credencial digital dentro de la propia aplicación, sin necesidad de abrir una ventana adicional.</w:t>
       </w:r>
     </w:p>
     <w:p>
@@ -1721,117 +1606,63 @@
           <w:rFonts w:ascii="Calibri" w:hAnsi="Calibri"/>
           <w:sz w:val="22"/>
         </w:rPr>
-        <w:t xml:space="preserve">Acceso a las secciones operativas del portal: Actividades, Calendario, Sedes, Alimentación, </w:t>
-      </w:r>
-      <w:r>
-        <w:rPr>
-          <w:rFonts w:ascii="Calibri" w:hAnsi="Calibri"/>
-          <w:b/>
-          <w:sz w:val="22"/>
-        </w:rPr>
-        <w:t>Premiaciones</w:t>
-      </w:r>
-      <w:r>
-        <w:rPr>
-          <w:rFonts w:ascii="Calibri" w:hAnsi="Calibri"/>
-          <w:sz w:val="22"/>
-        </w:rPr>
-        <w:t xml:space="preserve">, </w:t>
-      </w:r>
-      <w:r>
-        <w:rPr>
-          <w:rFonts w:ascii="Calibri" w:hAnsi="Calibri"/>
-          <w:b/>
-          <w:sz w:val="22"/>
-        </w:rPr>
-        <w:t>Cupones</w:t>
-      </w:r>
-      <w:r>
-        <w:rPr>
-          <w:rFonts w:ascii="Calibri" w:hAnsi="Calibri"/>
-          <w:sz w:val="22"/>
-        </w:rPr>
-        <w:t xml:space="preserve"> y Cuenta.</w:t>
-      </w:r>
-    </w:p>
-    <w:p>
-      <w:pPr>
-        <w:pStyle w:val="ListBullet"/>
-        <w:spacing w:before="0" w:after="40"/>
-        <w:ind w:left="340"/>
-      </w:pPr>
-      <w:r>
-        <w:rPr>
-          <w:rFonts w:ascii="Calibri" w:hAnsi="Calibri"/>
-          <w:b/>
-          <w:sz w:val="22"/>
-        </w:rPr>
-        <w:t>Pestaña Premiaciones</w:t>
-      </w:r>
-      <w:r>
-        <w:rPr>
-          <w:rFonts w:ascii="Calibri" w:hAnsi="Calibri"/>
-          <w:sz w:val="22"/>
-        </w:rPr>
-        <w:t xml:space="preserve"> con vista calendario + lista intercambiables y filtros, replicando la experiencia del portal del jefe de delegación.</w:t>
-      </w:r>
-    </w:p>
-    <w:p>
-      <w:pPr>
-        <w:pStyle w:val="ListBullet"/>
-        <w:spacing w:before="0" w:after="40"/>
-        <w:ind w:left="340"/>
-      </w:pPr>
-      <w:r>
-        <w:rPr>
-          <w:rFonts w:ascii="Calibri" w:hAnsi="Calibri"/>
-          <w:b/>
-          <w:sz w:val="22"/>
-        </w:rPr>
-        <w:t>Pestaña Cupones</w:t>
-      </w:r>
-      <w:r>
-        <w:rPr>
-          <w:rFonts w:ascii="Calibri" w:hAnsi="Calibri"/>
-          <w:sz w:val="22"/>
-        </w:rPr>
-        <w:t xml:space="preserve"> con catálogo y reclamo de QR.</w:t>
-      </w:r>
-    </w:p>
-    <w:p>
-      <w:pPr>
-        <w:pStyle w:val="ListBullet"/>
-        <w:spacing w:before="0" w:after="40"/>
-        <w:ind w:left="340"/>
-      </w:pPr>
-      <w:r>
-        <w:rPr>
-          <w:rFonts w:ascii="Calibri" w:hAnsi="Calibri"/>
-          <w:b/>
-          <w:sz w:val="22"/>
-        </w:rPr>
-        <w:t>Alimentación sin filtros por tipo de cliente</w:t>
-      </w:r>
-      <w:r>
-        <w:rPr>
-          <w:rFonts w:ascii="Calibri" w:hAnsi="Calibri"/>
-          <w:sz w:val="22"/>
-        </w:rPr>
-        <w:t>: catálogo completo de menús y lugares.</w:t>
-      </w:r>
-    </w:p>
-    <w:p>
-      <w:pPr>
-        <w:pStyle w:val="ListBullet"/>
-        <w:spacing w:before="0" w:after="40"/>
-        <w:ind w:left="340"/>
-      </w:pPr>
-      <w:r>
-        <w:rPr>
-          <w:rFonts w:ascii="Calibri" w:hAnsi="Calibri"/>
-          <w:sz w:val="22"/>
-        </w:rPr>
-        <w:t>Credencial digital como modal inline.</w:t>
+        <w:t>Acceso a las secciones operativas del portal: actividades, calendario, sedes, alimentación, premiaciones, cupones y cuenta.</w:t>
+      </w:r>
+    </w:p>
+    <w:p>
+      <w:pPr>
+        <w:pStyle w:val="ListBullet"/>
+        <w:spacing w:before="0" w:after="40"/>
+        <w:ind w:left="340"/>
+      </w:pPr>
+      <w:r>
+        <w:rPr>
+          <w:rFonts w:ascii="Calibri" w:hAnsi="Calibri"/>
+          <w:sz w:val="22"/>
+        </w:rPr>
+        <w:t>Sección de premiaciones con vista de calendario y vista de lista intercambiables, además de filtros equivalentes a los del portal del jefe de delegación.</w:t>
+      </w:r>
+    </w:p>
+    <w:p>
+      <w:pPr>
+        <w:pStyle w:val="ListBullet"/>
+        <w:spacing w:before="0" w:after="40"/>
+        <w:ind w:left="340"/>
+      </w:pPr>
+      <w:r>
+        <w:rPr>
+          <w:rFonts w:ascii="Calibri" w:hAnsi="Calibri"/>
+          <w:sz w:val="22"/>
+        </w:rPr>
+        <w:t>Sección de cupones con catálogo y reclamo del código QR.</w:t>
+      </w:r>
+    </w:p>
+    <w:p>
+      <w:pPr>
+        <w:pStyle w:val="ListBullet"/>
+        <w:spacing w:before="0" w:after="40"/>
+        <w:ind w:left="340"/>
+      </w:pPr>
+      <w:r>
+        <w:rPr>
+          <w:rFonts w:ascii="Calibri" w:hAnsi="Calibri"/>
+          <w:sz w:val="22"/>
+        </w:rPr>
+        <w:t>Visualización de la alimentación sin filtros por tipo de cliente: catálogo completo de menús y lugares de comida.</w:t>
+      </w:r>
+    </w:p>
+    <w:p>
+      <w:pPr>
+        <w:pStyle w:val="ListBullet"/>
+        <w:spacing w:before="0" w:after="40"/>
+        <w:ind w:left="340"/>
+      </w:pPr>
+      <w:r>
+        <w:rPr>
+          <w:rFonts w:ascii="Calibri" w:hAnsi="Calibri"/>
+          <w:sz w:val="22"/>
+        </w:rPr>
+        <w:t>Visualización de la credencial digital dentro de la propia aplicación, sin abrir una ventana adicional.</w:t>
       </w:r>
     </w:p>
     <w:p>
@@ -2007,17 +1838,9 @@
       <w:r>
         <w:rPr>
           <w:rFonts w:ascii="Calibri" w:hAnsi="Calibri"/>
-          <w:b/>
-          <w:sz w:val="22"/>
-        </w:rPr>
-        <w:t>Página "Monitoreo de Conductores"</w:t>
-      </w:r>
-      <w:r>
-        <w:rPr>
-          <w:rFonts w:ascii="Calibri" w:hAnsi="Calibri"/>
-          <w:sz w:val="22"/>
-        </w:rPr>
-        <w:t xml:space="preserve"> rediseñada con KPIs (conductores online, GPS recientes, viajes activos), tabla detallada del estado de cada conductor y mapa con sus posiciones en tiempo real (componente DriverPresenceMap con marcadores online/offline y popup con detalles del conductor).</w:t>
+          <w:sz w:val="22"/>
+        </w:rPr>
+        <w:t>Pantalla de monitoreo de conductores con indicadores agregados (conductores en línea, posiciones GPS recientes, viajes activos), tabla detallada del estado de cada conductor y mapa con sus posiciones en tiempo real, diferenciando visualmente a los conductores conectados de los desconectados y mostrando el detalle de cada uno al seleccionarlo.</w:t>
       </w:r>
     </w:p>
     <w:p>
@@ -2193,17 +2016,9 @@
       <w:r>
         <w:rPr>
           <w:rFonts w:ascii="Calibri" w:hAnsi="Calibri"/>
-          <w:b/>
-          <w:sz w:val="22"/>
-        </w:rPr>
-        <w:t>Integración con el módulo de Monitoreo de Conductores</w:t>
-      </w:r>
-      <w:r>
-        <w:rPr>
-          <w:rFonts w:ascii="Calibri" w:hAnsi="Calibri"/>
-          <w:sz w:val="22"/>
-        </w:rPr>
-        <w:t xml:space="preserve"> (ver sección 9) para visualizar en una sola vista la carga histórica y la presencia GPS en tiempo real.</w:t>
+          <w:sz w:val="22"/>
+        </w:rPr>
+        <w:t>Integración con la pantalla de monitoreo de conductores descrita en la sección 9, permitiendo visualizar en una sola vista la carga histórica de trabajo y la presencia GPS de los conductores en tiempo real.</w:t>
       </w:r>
     </w:p>
     <w:p>
@@ -2787,83 +2602,51 @@
       <w:r>
         <w:rPr>
           <w:rFonts w:ascii="Calibri" w:hAnsi="Calibri"/>
-          <w:b/>
-          <w:sz w:val="22"/>
-        </w:rPr>
-        <w:t>Mapa de Google Maps embebido en el widget</w:t>
-      </w:r>
-      <w:r>
-        <w:rPr>
-          <w:rFonts w:ascii="Calibri" w:hAnsi="Calibri"/>
-          <w:sz w:val="22"/>
-        </w:rPr>
-        <w:t xml:space="preserve"> para visualizar en vivo la posición de conductores y viajes consultados al asistente, sin salir de la conversación.</w:t>
-      </w:r>
-    </w:p>
-    <w:p>
-      <w:pPr>
-        <w:pStyle w:val="ListBullet"/>
-        <w:spacing w:before="0" w:after="40"/>
-        <w:ind w:left="340"/>
-      </w:pPr>
-      <w:r>
-        <w:rPr>
-          <w:rFonts w:ascii="Calibri" w:hAnsi="Calibri"/>
-          <w:b/>
-          <w:sz w:val="22"/>
-        </w:rPr>
-        <w:t>Mensajes de progreso personalizados</w:t>
-      </w:r>
-      <w:r>
-        <w:rPr>
-          <w:rFonts w:ascii="Calibri" w:hAnsi="Calibri"/>
-          <w:sz w:val="22"/>
-        </w:rPr>
-        <w:t xml:space="preserve"> durante la ejecución de herramientas: en lugar de etiquetas técnicas del tipo "calling tool xyz", el usuario ve mensajes naturales en español (≈53 etiquetas mapeadas: "Buscando conductores disponibles…", "Programando ceremonia…", etc.).</w:t>
-      </w:r>
-    </w:p>
-    <w:p>
-      <w:pPr>
-        <w:pStyle w:val="ListBullet"/>
-        <w:spacing w:before="0" w:after="40"/>
-        <w:ind w:left="340"/>
-      </w:pPr>
-      <w:r>
-        <w:rPr>
-          <w:rFonts w:ascii="Calibri" w:hAnsi="Calibri"/>
-          <w:b/>
-          <w:sz w:val="22"/>
-        </w:rPr>
-        <w:t>Botón "Nueva conversación"</w:t>
-      </w:r>
-      <w:r>
-        <w:rPr>
-          <w:rFonts w:ascii="Calibri" w:hAnsi="Calibri"/>
-          <w:sz w:val="22"/>
-        </w:rPr>
-        <w:t xml:space="preserve"> para reset rápido del contexto (limpia mensajes, response ID, tool info y errores).</w:t>
-      </w:r>
-    </w:p>
-    <w:p>
-      <w:pPr>
-        <w:pStyle w:val="ListBullet"/>
-        <w:spacing w:before="0" w:after="40"/>
-        <w:ind w:left="340"/>
-      </w:pPr>
-      <w:r>
-        <w:rPr>
-          <w:rFonts w:ascii="Calibri" w:hAnsi="Calibri"/>
-          <w:b/>
-          <w:sz w:val="22"/>
-        </w:rPr>
-        <w:t>Sanitización automática de argumentos</w:t>
-      </w:r>
-      <w:r>
-        <w:rPr>
-          <w:rFonts w:ascii="Calibri" w:hAnsi="Calibri"/>
-          <w:sz w:val="22"/>
-        </w:rPr>
-        <w:t xml:space="preserve"> antes de invocar herramientas (strip de strings vacíos para evitar errores como "invalid input syntax for type uuid").</w:t>
+          <w:sz w:val="22"/>
+        </w:rPr>
+        <w:t>Mapa interactivo embebido en la propia conversación, que permite visualizar en tiempo real la posición de los conductores y los viajes consultados al asistente sin salir del chat.</w:t>
+      </w:r>
+    </w:p>
+    <w:p>
+      <w:pPr>
+        <w:pStyle w:val="ListBullet"/>
+        <w:spacing w:before="0" w:after="40"/>
+        <w:ind w:left="340"/>
+      </w:pPr>
+      <w:r>
+        <w:rPr>
+          <w:rFonts w:ascii="Calibri" w:hAnsi="Calibri"/>
+          <w:sz w:val="22"/>
+        </w:rPr>
+        <w:t>Mensajes de progreso personalizados en español durante la ejecución de cada operación interna del asistente, mostrando al usuario una descripción comprensible de la acción en curso en lugar de etiquetas técnicas.</w:t>
+      </w:r>
+    </w:p>
+    <w:p>
+      <w:pPr>
+        <w:pStyle w:val="ListBullet"/>
+        <w:spacing w:before="0" w:after="40"/>
+        <w:ind w:left="340"/>
+      </w:pPr>
+      <w:r>
+        <w:rPr>
+          <w:rFonts w:ascii="Calibri" w:hAnsi="Calibri"/>
+          <w:sz w:val="22"/>
+        </w:rPr>
+        <w:t>Opción de iniciar una nueva conversación, que limpia el contexto, los mensajes anteriores y los errores acumulados.</w:t>
+      </w:r>
+    </w:p>
+    <w:p>
+      <w:pPr>
+        <w:pStyle w:val="ListBullet"/>
+        <w:spacing w:before="0" w:after="40"/>
+        <w:ind w:left="340"/>
+      </w:pPr>
+      <w:r>
+        <w:rPr>
+          <w:rFonts w:ascii="Calibri" w:hAnsi="Calibri"/>
+          <w:sz w:val="22"/>
+        </w:rPr>
+        <w:t>Validación automática de los parámetros entregados al asistente antes de ejecutar cada operación, descartando valores vacíos o inválidos para evitar errores en la plataforma.</w:t>
       </w:r>
     </w:p>
     <w:p>
@@ -3929,36 +3712,21 @@
           <w:rFonts w:ascii="Calibri" w:hAnsi="Calibri"/>
           <w:sz w:val="22"/>
         </w:rPr>
-        <w:t xml:space="preserve">: la sección de premiaciones se encuentra disponible no solo en el portal VIP sino también en los portales de jefe de delegación y atleta, con </w:t>
-      </w:r>
+        <w:t>: la sección de premiaciones se encuentra disponible no solo en el portal VIP sino también en los portales del jefe de delegación y del atleta, con vista de calendario y vista de lista intercambiables, filtros por estado, disciplina, sede y búsqueda libre, agrupación por día y resumen de entregadores por rol.</w:t>
+      </w:r>
+    </w:p>
+    <w:p>
+      <w:pPr>
+        <w:pStyle w:val="ListBullet"/>
+        <w:spacing w:before="0" w:after="40"/>
+        <w:ind w:left="340"/>
+      </w:pPr>
       <w:r>
         <w:rPr>
           <w:rFonts w:ascii="Calibri" w:hAnsi="Calibri"/>
           <w:b/>
           <w:sz w:val="22"/>
         </w:rPr>
-        <w:t>vista calendario + vista lista intercambiables</w:t>
-      </w:r>
-      <w:r>
-        <w:rPr>
-          <w:rFonts w:ascii="Calibri" w:hAnsi="Calibri"/>
-          <w:sz w:val="22"/>
-        </w:rPr>
-        <w:t>, filtros por estado/disciplina/sede/búsqueda libre, agrupación por día y resumen de entregadores por rol.</w:t>
-      </w:r>
-    </w:p>
-    <w:p>
-      <w:pPr>
-        <w:pStyle w:val="ListBullet"/>
-        <w:spacing w:before="0" w:after="40"/>
-        <w:ind w:left="340"/>
-      </w:pPr>
-      <w:r>
-        <w:rPr>
-          <w:rFonts w:ascii="Calibri" w:hAnsi="Calibri"/>
-          <w:b/>
-          <w:sz w:val="22"/>
-        </w:rPr>
         <w:t>Filtros por asistencia</w:t>
       </w:r>
       <w:r>
@@ -3966,7 +3734,7 @@
           <w:rFonts w:ascii="Calibri" w:hAnsi="Calibri"/>
           <w:sz w:val="22"/>
         </w:rPr>
-        <w:t xml:space="preserve"> (en portal VIP): Confirmadas / Pendientes / Declinadas, con badges visuales por estado.</w:t>
+        <w:t xml:space="preserve"> en el portal VIP: confirmadas, pendientes y declinadas, con diferenciación visual por estado.</w:t>
       </w:r>
     </w:p>
     <w:p>
@@ -4442,7 +4210,7 @@
           <w:color w:val="0F9E87"/>
           <w:sz w:val="28"/>
         </w:rPr>
-        <w:t>22. Sistema de Cupones y Beneficios (NUEVO)</w:t>
+        <w:t>22. Sistema de Cupones y Beneficios</w:t>
       </w:r>
     </w:p>
     <w:p>
@@ -4455,7 +4223,7 @@
           <w:color w:val="334155"/>
           <w:sz w:val="22"/>
         </w:rPr>
-        <w:t>Permite ofrecer a los participantes del evento un catálogo digital de beneficios y descuentos en comercios aliados, con flujo completo desde la publicación del cupón hasta su canje en el local del partner.</w:t>
+        <w:t>Permite ofrecer a los participantes del evento un catálogo digital de beneficios y descuentos en comercios aliados, gestionando todo el flujo desde la publicación del cupón hasta su canje en el local del comercio.</w:t>
       </w:r>
     </w:p>
     <w:p>
@@ -4480,185 +4248,107 @@
       <w:r>
         <w:rPr>
           <w:rFonts w:ascii="Calibri" w:hAnsi="Calibri"/>
-          <w:b/>
-          <w:sz w:val="22"/>
-        </w:rPr>
-        <w:t>Catálogo de cupones</w:t>
-      </w:r>
-      <w:r>
-        <w:rPr>
-          <w:rFonts w:ascii="Calibri" w:hAnsi="Calibri"/>
-          <w:sz w:val="22"/>
-        </w:rPr>
-        <w:t xml:space="preserve"> con foto, partner asociado, categoría (Comida, Entretenimiento, Tienda, Otros), tipo de descuento (porcentaje, monto, gratis), términos y condiciones, validez temporal (desde / hasta) y límite máximo de reclamos por usuario.</w:t>
-      </w:r>
-    </w:p>
-    <w:p>
-      <w:pPr>
-        <w:pStyle w:val="ListBullet"/>
-        <w:spacing w:before="0" w:after="40"/>
-        <w:ind w:left="340"/>
-      </w:pPr>
-      <w:r>
-        <w:rPr>
-          <w:rFonts w:ascii="Calibri" w:hAnsi="Calibri"/>
-          <w:b/>
-          <w:sz w:val="22"/>
-        </w:rPr>
-        <w:t>Reclamo de cupón</w:t>
-      </w:r>
-      <w:r>
-        <w:rPr>
-          <w:rFonts w:ascii="Calibri" w:hAnsi="Calibri"/>
-          <w:sz w:val="22"/>
-        </w:rPr>
-        <w:t xml:space="preserve"> desde el portal del participante (VIP, jefe de delegación y atleta) que genera de forma inmediata un </w:t>
-      </w:r>
-      <w:r>
-        <w:rPr>
-          <w:rFonts w:ascii="Calibri" w:hAnsi="Calibri"/>
-          <w:b/>
-          <w:sz w:val="22"/>
-        </w:rPr>
-        <w:t>código único + token QR</w:t>
-      </w:r>
-      <w:r>
-        <w:rPr>
-          <w:rFonts w:ascii="Calibri" w:hAnsi="Calibri"/>
-          <w:sz w:val="22"/>
-        </w:rPr>
-        <w:t xml:space="preserve"> asociado al usuario.</w:t>
-      </w:r>
-    </w:p>
-    <w:p>
-      <w:pPr>
-        <w:pStyle w:val="ListBullet"/>
-        <w:spacing w:before="0" w:after="40"/>
-        <w:ind w:left="340"/>
-      </w:pPr>
-      <w:r>
-        <w:rPr>
-          <w:rFonts w:ascii="Calibri" w:hAnsi="Calibri"/>
-          <w:b/>
-          <w:sz w:val="22"/>
-        </w:rPr>
-        <w:t>Modal de QR fullscreen</w:t>
-      </w:r>
-      <w:r>
-        <w:rPr>
-          <w:rFonts w:ascii="Calibri" w:hAnsi="Calibri"/>
-          <w:sz w:val="22"/>
-        </w:rPr>
-        <w:t xml:space="preserve"> dentro del portal con el código de barras QR escaneable, código de respaldo en formato monoespaciado destacado, instrucciones de canje y términos del beneficio.</w:t>
-      </w:r>
-    </w:p>
-    <w:p>
-      <w:pPr>
-        <w:pStyle w:val="ListBullet"/>
-        <w:spacing w:before="0" w:after="40"/>
-        <w:ind w:left="340"/>
-      </w:pPr>
-      <w:r>
-        <w:rPr>
-          <w:rFonts w:ascii="Calibri" w:hAnsi="Calibri"/>
-          <w:b/>
-          <w:sz w:val="22"/>
-        </w:rPr>
-        <w:t>Estados del claim</w:t>
-      </w:r>
-      <w:r>
-        <w:rPr>
-          <w:rFonts w:ascii="Calibri" w:hAnsi="Calibri"/>
-          <w:sz w:val="22"/>
-        </w:rPr>
-        <w:t>: Reclamado / Canjeado / Expirado / Anulado, con visualización en sub-pestaña "Mis cupones" del portal del participante.</w:t>
-      </w:r>
-    </w:p>
-    <w:p>
-      <w:pPr>
-        <w:pStyle w:val="ListBullet"/>
-        <w:spacing w:before="0" w:after="40"/>
-        <w:ind w:left="340"/>
-      </w:pPr>
-      <w:r>
-        <w:rPr>
-          <w:rFonts w:ascii="Calibri" w:hAnsi="Calibri"/>
-          <w:b/>
-          <w:sz w:val="22"/>
-        </w:rPr>
-        <w:t>Portal Partner independiente</w:t>
-      </w:r>
-      <w:r>
-        <w:rPr>
-          <w:rFonts w:ascii="Calibri" w:hAnsi="Calibri"/>
-          <w:sz w:val="22"/>
-        </w:rPr>
-        <w:t xml:space="preserve"> para el comercio aliado, que permite escanear el QR del cupón, validar su autenticidad y marcar el canje en la plataforma.</w:t>
-      </w:r>
-    </w:p>
-    <w:p>
-      <w:pPr>
-        <w:pStyle w:val="ListBullet"/>
-        <w:spacing w:before="0" w:after="40"/>
-        <w:ind w:left="340"/>
-      </w:pPr>
-      <w:r>
-        <w:rPr>
-          <w:rFonts w:ascii="Calibri" w:hAnsi="Calibri"/>
-          <w:b/>
-          <w:sz w:val="22"/>
-        </w:rPr>
-        <w:t>Sin login adicional</w:t>
-      </w:r>
-      <w:r>
-        <w:rPr>
-          <w:rFonts w:ascii="Calibri" w:hAnsi="Calibri"/>
-          <w:sz w:val="22"/>
-        </w:rPr>
-        <w:t>: el acceso al catálogo y al reclamo se realiza reutilizando la sesión del portal del participante (athlete-code o credenciales Supabase Auth), sin requerir un segundo inicio de sesión.</w:t>
-      </w:r>
-    </w:p>
-    <w:p>
-      <w:pPr>
-        <w:pStyle w:val="ListBullet"/>
-        <w:spacing w:before="0" w:after="40"/>
-        <w:ind w:left="340"/>
-      </w:pPr>
-      <w:r>
-        <w:rPr>
-          <w:rFonts w:ascii="Calibri" w:hAnsi="Calibri"/>
-          <w:sz w:val="22"/>
-        </w:rPr>
-        <w:t xml:space="preserve">Disponible para </w:t>
-      </w:r>
-      <w:r>
-        <w:rPr>
-          <w:rFonts w:ascii="Calibri" w:hAnsi="Calibri"/>
-          <w:b/>
-          <w:sz w:val="22"/>
-        </w:rPr>
-        <w:t>todos los tipos de rol</w:t>
-      </w:r>
-      <w:r>
-        <w:rPr>
-          <w:rFonts w:ascii="Calibri" w:hAnsi="Calibri"/>
-          <w:sz w:val="22"/>
-        </w:rPr>
-        <w:t xml:space="preserve"> (atleta, jefe de delegación, VIP) sin filtros adicionales.</w:t>
-      </w:r>
-    </w:p>
-    <w:p>
-      <w:pPr>
-        <w:pStyle w:val="ListBullet"/>
-        <w:spacing w:before="0" w:after="40"/>
-        <w:ind w:left="340"/>
-      </w:pPr>
-      <w:r>
-        <w:rPr>
-          <w:rFonts w:ascii="Calibri" w:hAnsi="Calibri"/>
-          <w:sz w:val="22"/>
-        </w:rPr>
-        <w:t>Administración desde la plataforma central: alta de cupones, edición, baja, control de stock y vigencia.</w:t>
+          <w:sz w:val="22"/>
+        </w:rPr>
+        <w:t>Catálogo de cupones con fotografía, comercio asociado, categoría (comida, entretenimiento, tienda, otros), tipo de descuento (porcentaje, monto fijo, gratuito), términos y condiciones, vigencia (fecha de inicio y término) y límite máximo de canjes por participante.</w:t>
+      </w:r>
+    </w:p>
+    <w:p>
+      <w:pPr>
+        <w:pStyle w:val="ListBullet"/>
+        <w:spacing w:before="0" w:after="40"/>
+        <w:ind w:left="340"/>
+      </w:pPr>
+      <w:r>
+        <w:rPr>
+          <w:rFonts w:ascii="Calibri" w:hAnsi="Calibri"/>
+          <w:sz w:val="22"/>
+        </w:rPr>
+        <w:t>Reclamo de cupón desde el portal del participante (VIP, jefe de delegación o atleta) con generación inmediata de un código único y un código QR asociado al usuario.</w:t>
+      </w:r>
+    </w:p>
+    <w:p>
+      <w:pPr>
+        <w:pStyle w:val="ListBullet"/>
+        <w:spacing w:before="0" w:after="40"/>
+        <w:ind w:left="340"/>
+      </w:pPr>
+      <w:r>
+        <w:rPr>
+          <w:rFonts w:ascii="Calibri" w:hAnsi="Calibri"/>
+          <w:sz w:val="22"/>
+        </w:rPr>
+        <w:t>Visualización del cupón reclamado en pantalla completa dentro del portal, con el código QR escaneable por el comercio, código de respaldo destacado, instrucciones de canje y términos del beneficio.</w:t>
+      </w:r>
+    </w:p>
+    <w:p>
+      <w:pPr>
+        <w:pStyle w:val="ListBullet"/>
+        <w:spacing w:before="0" w:after="40"/>
+        <w:ind w:left="340"/>
+      </w:pPr>
+      <w:r>
+        <w:rPr>
+          <w:rFonts w:ascii="Calibri" w:hAnsi="Calibri"/>
+          <w:sz w:val="22"/>
+        </w:rPr>
+        <w:t>Estados del cupón reclamado: reclamado, canjeado, expirado y anulado, visibles para el participante en la sección Mis Cupones de su portal.</w:t>
+      </w:r>
+    </w:p>
+    <w:p>
+      <w:pPr>
+        <w:pStyle w:val="ListBullet"/>
+        <w:spacing w:before="0" w:after="40"/>
+        <w:ind w:left="340"/>
+      </w:pPr>
+      <w:r>
+        <w:rPr>
+          <w:rFonts w:ascii="Calibri" w:hAnsi="Calibri"/>
+          <w:sz w:val="22"/>
+        </w:rPr>
+        <w:t>Portal independiente para el comercio aliado, que permite escanear el código QR del cupón, validar su autenticidad contra la plataforma y registrar el canje efectivo.</w:t>
+      </w:r>
+    </w:p>
+    <w:p>
+      <w:pPr>
+        <w:pStyle w:val="ListBullet"/>
+        <w:spacing w:before="0" w:after="40"/>
+        <w:ind w:left="340"/>
+      </w:pPr>
+      <w:r>
+        <w:rPr>
+          <w:rFonts w:ascii="Calibri" w:hAnsi="Calibri"/>
+          <w:sz w:val="22"/>
+        </w:rPr>
+        <w:t>Acceso sin inicio de sesión adicional: el catálogo y el reclamo reutilizan la sesión del portal del participante, sin requerir credenciales adicionales.</w:t>
+      </w:r>
+    </w:p>
+    <w:p>
+      <w:pPr>
+        <w:pStyle w:val="ListBullet"/>
+        <w:spacing w:before="0" w:after="40"/>
+        <w:ind w:left="340"/>
+      </w:pPr>
+      <w:r>
+        <w:rPr>
+          <w:rFonts w:ascii="Calibri" w:hAnsi="Calibri"/>
+          <w:sz w:val="22"/>
+        </w:rPr>
+        <w:t>Disponibilidad transversal para todos los tipos de cliente (atleta, jefe de delegación, VIP) sin filtros por rol.</w:t>
+      </w:r>
+    </w:p>
+    <w:p>
+      <w:pPr>
+        <w:pStyle w:val="ListBullet"/>
+        <w:spacing w:before="0" w:after="40"/>
+        <w:ind w:left="340"/>
+      </w:pPr>
+      <w:r>
+        <w:rPr>
+          <w:rFonts w:ascii="Calibri" w:hAnsi="Calibri"/>
+          <w:sz w:val="22"/>
+        </w:rPr>
+        <w:t>Administración del catálogo desde el módulo central: alta, edición, baja, control de stock y vigencia.</w:t>
       </w:r>
     </w:p>
     <w:p>
@@ -4685,35 +4375,35 @@
           <w:rFonts w:ascii="Calibri" w:hAnsi="Calibri"/>
           <w:sz w:val="22"/>
         </w:rPr>
-        <w:t>Formulario de alta de cupón con foto, datos del partner, categoría, tipo y valor de descuento, vigencia y límite por usuario.</w:t>
-      </w:r>
-    </w:p>
-    <w:p>
-      <w:pPr>
-        <w:pStyle w:val="ListBullet"/>
-        <w:spacing w:before="0" w:after="40"/>
-        <w:ind w:left="340"/>
-      </w:pPr>
-      <w:r>
-        <w:rPr>
-          <w:rFonts w:ascii="Calibri" w:hAnsi="Calibri"/>
-          <w:sz w:val="22"/>
-        </w:rPr>
-        <w:t>Persistencia automática de cada reclamo (claim) con el usuario, fecha, código único, qrToken, expiración y estado.</w:t>
-      </w:r>
-    </w:p>
-    <w:p>
-      <w:pPr>
-        <w:pStyle w:val="ListBullet"/>
-        <w:spacing w:before="0" w:after="40"/>
-        <w:ind w:left="340"/>
-      </w:pPr>
-      <w:r>
-        <w:rPr>
-          <w:rFonts w:ascii="Calibri" w:hAnsi="Calibri"/>
-          <w:sz w:val="22"/>
-        </w:rPr>
-        <w:t>Registro de cada canje con fecha, hora y partner que ejecutó la operación, para fines de auditoría y conciliación.</w:t>
+        <w:t>Formulario de alta de cupón con fotografía, datos del comercio aliado, categoría, tipo y valor de descuento, vigencia y límite por participante.</w:t>
+      </w:r>
+    </w:p>
+    <w:p>
+      <w:pPr>
+        <w:pStyle w:val="ListBullet"/>
+        <w:spacing w:before="0" w:after="40"/>
+        <w:ind w:left="340"/>
+      </w:pPr>
+      <w:r>
+        <w:rPr>
+          <w:rFonts w:ascii="Calibri" w:hAnsi="Calibri"/>
+          <w:sz w:val="22"/>
+        </w:rPr>
+        <w:t>Persistencia automática de cada cupón reclamado con el participante, fecha, código único, código QR, fecha de expiración y estado actual.</w:t>
+      </w:r>
+    </w:p>
+    <w:p>
+      <w:pPr>
+        <w:pStyle w:val="ListBullet"/>
+        <w:spacing w:before="0" w:after="40"/>
+        <w:ind w:left="340"/>
+      </w:pPr>
+      <w:r>
+        <w:rPr>
+          <w:rFonts w:ascii="Calibri" w:hAnsi="Calibri"/>
+          <w:sz w:val="22"/>
+        </w:rPr>
+        <w:t>Registro de cada canje con fecha, hora y comercio que ejecutó la operación, para fines de auditoría y conciliación.</w:t>
       </w:r>
     </w:p>
     <w:p>
@@ -4726,7 +4416,7 @@
           <w:color w:val="0F9E87"/>
           <w:sz w:val="28"/>
         </w:rPr>
-        <w:t>23. Gestión de Staff y Voluntarios — Workforce (NUEVO)</w:t>
+        <w:t>23. Gestión de Personal Operativo y Voluntarios</w:t>
       </w:r>
     </w:p>
     <w:p>
@@ -4739,7 +4429,7 @@
           <w:color w:val="334155"/>
           <w:sz w:val="22"/>
         </w:rPr>
-        <w:t>Permite administrar al personal operativo del evento que no es participante (staff, voluntarios, agentes de soporte, supervisores) y el inventario de productos y materiales que se entregan a cada persona durante la operación.</w:t>
+        <w:t>Permite administrar al personal operativo del evento que no es participante deportivo (personal de servicio, voluntarios, agentes de soporte, supervisores) y controlar el inventario de productos y materiales entregados a cada persona durante la operación.</w:t>
       </w:r>
     </w:p>
     <w:p>
@@ -4764,105 +4454,65 @@
       <w:r>
         <w:rPr>
           <w:rFonts w:ascii="Calibri" w:hAnsi="Calibri"/>
-          <w:b/>
-          <w:sz w:val="22"/>
-        </w:rPr>
-        <w:t>Registro de personal de workforce</w:t>
-      </w:r>
-      <w:r>
-        <w:rPr>
-          <w:rFonts w:ascii="Calibri" w:hAnsi="Calibri"/>
-          <w:sz w:val="22"/>
-        </w:rPr>
-        <w:t xml:space="preserve"> con categoría (staff, voluntario, supervisor, agente), foto, datos de contacto, área asignada y estado de validación.</w:t>
-      </w:r>
-    </w:p>
-    <w:p>
-      <w:pPr>
-        <w:pStyle w:val="ListBullet"/>
-        <w:spacing w:before="0" w:after="40"/>
-        <w:ind w:left="340"/>
-      </w:pPr>
-      <w:r>
-        <w:rPr>
-          <w:rFonts w:ascii="Calibri" w:hAnsi="Calibri"/>
-          <w:b/>
-          <w:sz w:val="22"/>
-        </w:rPr>
-        <w:t>Catálogo de productos asignables</w:t>
-      </w:r>
-      <w:r>
-        <w:rPr>
-          <w:rFonts w:ascii="Calibri" w:hAnsi="Calibri"/>
-          <w:sz w:val="22"/>
-        </w:rPr>
-        <w:t>: uniformes, kits, credenciales físicas, materiales operativos, con código de barras (Code 128) único por producto.</w:t>
-      </w:r>
-    </w:p>
-    <w:p>
-      <w:pPr>
-        <w:pStyle w:val="ListBullet"/>
-        <w:spacing w:before="0" w:after="40"/>
-        <w:ind w:left="340"/>
-      </w:pPr>
-      <w:r>
-        <w:rPr>
-          <w:rFonts w:ascii="Calibri" w:hAnsi="Calibri"/>
-          <w:b/>
-          <w:sz w:val="22"/>
-        </w:rPr>
-        <w:t>Registro de entregas</w:t>
-      </w:r>
-      <w:r>
-        <w:rPr>
-          <w:rFonts w:ascii="Calibri" w:hAnsi="Calibri"/>
-          <w:sz w:val="22"/>
-        </w:rPr>
-        <w:t xml:space="preserve"> asociando producto → persona, con fecha, responsable de la entrega y observaciones.</w:t>
-      </w:r>
-    </w:p>
-    <w:p>
-      <w:pPr>
-        <w:pStyle w:val="ListBullet"/>
-        <w:spacing w:before="0" w:after="40"/>
-        <w:ind w:left="340"/>
-      </w:pPr>
-      <w:r>
-        <w:rPr>
-          <w:rFonts w:ascii="Calibri" w:hAnsi="Calibri"/>
-          <w:b/>
-          <w:sz w:val="22"/>
-        </w:rPr>
-        <w:t>Tablas customizadas</w:t>
-      </w:r>
-      <w:r>
-        <w:rPr>
-          <w:rFonts w:ascii="Calibri" w:hAnsi="Calibri"/>
-          <w:sz w:val="22"/>
-        </w:rPr>
-        <w:t xml:space="preserve"> con el sistema de diseño del proyecto: avatares con iniciales, mini-bars de progreso, chips de categoría con íconos, contact cells con teléfono/email, badges de validación.</w:t>
-      </w:r>
-    </w:p>
-    <w:p>
-      <w:pPr>
-        <w:pStyle w:val="ListBullet"/>
-        <w:spacing w:before="0" w:after="40"/>
-        <w:ind w:left="340"/>
-      </w:pPr>
-      <w:r>
-        <w:rPr>
-          <w:rFonts w:ascii="Calibri" w:hAnsi="Calibri"/>
-          <w:b/>
-          <w:sz w:val="22"/>
-        </w:rPr>
-        <w:t>Impresión de etiquetas con código de barras</w:t>
-      </w:r>
-      <w:r>
-        <w:rPr>
-          <w:rFonts w:ascii="Calibri" w:hAnsi="Calibri"/>
-          <w:sz w:val="22"/>
-        </w:rPr>
-        <w:t xml:space="preserve"> (Code 128) en formato individual o por lote, generadas con la librería jsbarcode (renderizado SVG) y abiertas en ventana imprimible.</w:t>
+          <w:sz w:val="22"/>
+        </w:rPr>
+        <w:t>Registro del personal operativo con categoría (personal de servicio, voluntario, supervisor, agente), fotografía, datos de contacto, área asignada y estado de validación.</w:t>
+      </w:r>
+    </w:p>
+    <w:p>
+      <w:pPr>
+        <w:pStyle w:val="ListBullet"/>
+        <w:spacing w:before="0" w:after="40"/>
+        <w:ind w:left="340"/>
+      </w:pPr>
+      <w:r>
+        <w:rPr>
+          <w:rFonts w:ascii="Calibri" w:hAnsi="Calibri"/>
+          <w:sz w:val="22"/>
+        </w:rPr>
+        <w:t>Catálogo de productos asignables (uniformes, kits, credenciales físicas, materiales operativos) con código de barras único por producto.</w:t>
+      </w:r>
+    </w:p>
+    <w:p>
+      <w:pPr>
+        <w:pStyle w:val="ListBullet"/>
+        <w:spacing w:before="0" w:after="40"/>
+        <w:ind w:left="340"/>
+      </w:pPr>
+      <w:r>
+        <w:rPr>
+          <w:rFonts w:ascii="Calibri" w:hAnsi="Calibri"/>
+          <w:sz w:val="22"/>
+        </w:rPr>
+        <w:t>Registro de entregas asociando producto y persona, con fecha, responsable de la entrega y observaciones.</w:t>
+      </w:r>
+    </w:p>
+    <w:p>
+      <w:pPr>
+        <w:pStyle w:val="ListBullet"/>
+        <w:spacing w:before="0" w:after="40"/>
+        <w:ind w:left="340"/>
+      </w:pPr>
+      <w:r>
+        <w:rPr>
+          <w:rFonts w:ascii="Calibri" w:hAnsi="Calibri"/>
+          <w:sz w:val="22"/>
+        </w:rPr>
+        <w:t>Visualización del personal y de los productos con tablas operativas que incluyen avatar con iniciales, indicadores de progreso, etiquetas de categoría, datos de contacto y estado de validación.</w:t>
+      </w:r>
+    </w:p>
+    <w:p>
+      <w:pPr>
+        <w:pStyle w:val="ListBullet"/>
+        <w:spacing w:before="0" w:after="40"/>
+        <w:ind w:left="340"/>
+      </w:pPr>
+      <w:r>
+        <w:rPr>
+          <w:rFonts w:ascii="Calibri" w:hAnsi="Calibri"/>
+          <w:sz w:val="22"/>
+        </w:rPr>
+        <w:t>Impresión de etiquetas con código de barras en formato individual o por lote, en hoja imprimible lista para enviar al impresor.</w:t>
       </w:r>
     </w:p>
     <w:p>
@@ -4903,7 +4553,7 @@
           <w:rFonts w:ascii="Calibri" w:hAnsi="Calibri"/>
           <w:sz w:val="22"/>
         </w:rPr>
-        <w:t>Formulario de alta de persona de workforce con validación de duplicados.</w:t>
+        <w:t>Formulario de alta del personal operativo con validación de duplicados.</w:t>
       </w:r>
     </w:p>
     <w:p>
@@ -4931,7 +4581,7 @@
           <w:rFonts w:ascii="Calibri" w:hAnsi="Calibri"/>
           <w:sz w:val="22"/>
         </w:rPr>
-        <w:t>Registro de entrega con trazabilidad completa (quién entregó, a quién, cuándo y qué producto).</w:t>
+        <w:t>Registro de entrega con trazabilidad completa: identificación del responsable, persona receptora, fecha y producto entregado.</w:t>
       </w:r>
     </w:p>
     <w:p>
@@ -4944,7 +4594,7 @@
           <w:color w:val="0F9E87"/>
           <w:sz w:val="28"/>
         </w:rPr>
-        <w:t>24. Módulo de Acreditaciones (NUEVO)</w:t>
+        <w:t>24. Gestión Administrativa de Acreditaciones</w:t>
       </w:r>
     </w:p>
     <w:p>
@@ -4957,7 +4607,7 @@
           <w:color w:val="334155"/>
           <w:sz w:val="22"/>
         </w:rPr>
-        <w:t>Complementa al punto 19 (trazabilidad QR en terreno) con la gestión administrativa de la acreditación: solicitud, aprobación y generación de la credencial digital del participante o conductor.</w:t>
+        <w:t>Complementa al punto 19 (trazabilidad mediante código QR en terreno) con la gestión administrativa previa a la operación: solicitud, aprobación y generación de la credencial digital del participante o conductor.</w:t>
       </w:r>
     </w:p>
     <w:p>
@@ -4982,127 +4632,79 @@
       <w:r>
         <w:rPr>
           <w:rFonts w:ascii="Calibri" w:hAnsi="Calibri"/>
-          <w:b/>
-          <w:sz w:val="22"/>
-        </w:rPr>
-        <w:t>Solicitud de acreditación</w:t>
-      </w:r>
-      <w:r>
-        <w:rPr>
-          <w:rFonts w:ascii="Calibri" w:hAnsi="Calibri"/>
-          <w:sz w:val="22"/>
-        </w:rPr>
-        <w:t xml:space="preserve"> para participantes y conductores, con asignación de tipos de acceso (sedes deportivas, zonas restringidas, hoteles, áreas de prensa).</w:t>
-      </w:r>
-    </w:p>
-    <w:p>
-      <w:pPr>
-        <w:pStyle w:val="ListBullet"/>
-        <w:spacing w:before="0" w:after="40"/>
-        <w:ind w:left="340"/>
-      </w:pPr>
-      <w:r>
-        <w:rPr>
-          <w:rFonts w:ascii="Calibri" w:hAnsi="Calibri"/>
-          <w:b/>
-          <w:sz w:val="22"/>
-        </w:rPr>
-        <w:t>Estados de la acreditación</w:t>
-      </w:r>
-      <w:r>
-        <w:rPr>
-          <w:rFonts w:ascii="Calibri" w:hAnsi="Calibri"/>
-          <w:sz w:val="22"/>
-        </w:rPr>
-        <w:t>: pendiente, aprobada, rechazada, vencida, con transiciones registradas.</w:t>
-      </w:r>
-    </w:p>
-    <w:p>
-      <w:pPr>
-        <w:pStyle w:val="ListBullet"/>
-        <w:spacing w:before="0" w:after="40"/>
-        <w:ind w:left="340"/>
-      </w:pPr>
-      <w:r>
-        <w:rPr>
-          <w:rFonts w:ascii="Calibri" w:hAnsi="Calibri"/>
-          <w:b/>
-          <w:sz w:val="22"/>
-        </w:rPr>
-        <w:t>Generación e impresión de la credencial digital</w:t>
-      </w:r>
-      <w:r>
-        <w:rPr>
-          <w:rFonts w:ascii="Calibri" w:hAnsi="Calibri"/>
-          <w:sz w:val="22"/>
-        </w:rPr>
-        <w:t xml:space="preserve"> con foto del titular, datos personales, código QR, franjas horarias o de acceso permitidas, y branding institucional.</w:t>
-      </w:r>
-    </w:p>
-    <w:p>
-      <w:pPr>
-        <w:pStyle w:val="ListBullet"/>
-        <w:spacing w:before="0" w:after="40"/>
-        <w:ind w:left="340"/>
-      </w:pPr>
-      <w:r>
-        <w:rPr>
-          <w:rFonts w:ascii="Calibri" w:hAnsi="Calibri"/>
-          <w:b/>
-          <w:sz w:val="22"/>
-        </w:rPr>
-        <w:t>Lectura de foto en cascada desde metadata</w:t>
-      </w:r>
-      <w:r>
-        <w:rPr>
-          <w:rFonts w:ascii="Calibri" w:hAnsi="Calibri"/>
-          <w:sz w:val="22"/>
-        </w:rPr>
-        <w:t xml:space="preserve"> del participante (claves: photoUrl, photo_url, avatar, avatarUrl, imageUrl, image_url), con fallback a placeholder "SIN FOTO" si ninguna está disponible.</w:t>
-      </w:r>
-    </w:p>
-    <w:p>
-      <w:pPr>
-        <w:pStyle w:val="ListBullet"/>
-        <w:spacing w:before="0" w:after="40"/>
-        <w:ind w:left="340"/>
-      </w:pPr>
-      <w:r>
-        <w:rPr>
-          <w:rFonts w:ascii="Calibri" w:hAnsi="Calibri"/>
-          <w:b/>
-          <w:sz w:val="22"/>
-        </w:rPr>
-        <w:t>Modal inline para previsualización</w:t>
-      </w:r>
-      <w:r>
-        <w:rPr>
-          <w:rFonts w:ascii="Calibri" w:hAnsi="Calibri"/>
-          <w:sz w:val="22"/>
-        </w:rPr>
-        <w:t xml:space="preserve"> de la credencial dentro del portal (iframe con srcDoc), con botón opcional para abrir en ventana aparte e imprimir.</w:t>
-      </w:r>
-    </w:p>
-    <w:p>
-      <w:pPr>
-        <w:pStyle w:val="ListBullet"/>
-        <w:spacing w:before="0" w:after="40"/>
-        <w:ind w:left="340"/>
-      </w:pPr>
-      <w:r>
-        <w:rPr>
-          <w:rFonts w:ascii="Calibri" w:hAnsi="Calibri"/>
-          <w:b/>
-          <w:sz w:val="22"/>
-        </w:rPr>
-        <w:t>Plantilla responsive</w:t>
-      </w:r>
-      <w:r>
-        <w:rPr>
-          <w:rFonts w:ascii="Calibri" w:hAnsi="Calibri"/>
-          <w:sz w:val="22"/>
-        </w:rPr>
-        <w:t xml:space="preserve"> de la credencial: tamaño A4 landscape para impresión profesional, breakpoints para visualización en mobile con QR y datos optimizados.</w:t>
+          <w:sz w:val="22"/>
+        </w:rPr>
+        <w:t>Solicitud de acreditación para participantes y conductores, con asignación de los tipos de acceso correspondientes (sedes deportivas, zonas restringidas, hoteles, áreas de prensa).</w:t>
+      </w:r>
+    </w:p>
+    <w:p>
+      <w:pPr>
+        <w:pStyle w:val="ListBullet"/>
+        <w:spacing w:before="0" w:after="40"/>
+        <w:ind w:left="340"/>
+      </w:pPr>
+      <w:r>
+        <w:rPr>
+          <w:rFonts w:ascii="Calibri" w:hAnsi="Calibri"/>
+          <w:sz w:val="22"/>
+        </w:rPr>
+        <w:t>Estados de la acreditación: pendiente, aprobada, rechazada y vencida, con registro de cada transición y del usuario que la ejecutó.</w:t>
+      </w:r>
+    </w:p>
+    <w:p>
+      <w:pPr>
+        <w:pStyle w:val="ListBullet"/>
+        <w:spacing w:before="0" w:after="40"/>
+        <w:ind w:left="340"/>
+      </w:pPr>
+      <w:r>
+        <w:rPr>
+          <w:rFonts w:ascii="Calibri" w:hAnsi="Calibri"/>
+          <w:sz w:val="22"/>
+        </w:rPr>
+        <w:t>Generación e impresión de la credencial digital con fotografía del titular, datos personales, código QR, zonas de acceso permitidas e identidad institucional del evento.</w:t>
+      </w:r>
+    </w:p>
+    <w:p>
+      <w:pPr>
+        <w:pStyle w:val="ListBullet"/>
+        <w:spacing w:before="0" w:after="40"/>
+        <w:ind w:left="340"/>
+      </w:pPr>
+      <w:r>
+        <w:rPr>
+          <w:rFonts w:ascii="Calibri" w:hAnsi="Calibri"/>
+          <w:sz w:val="22"/>
+        </w:rPr>
+        <w:t>Resolución automática de la fotografía del titular a partir de los datos del participante, con visualización de un marcador de ausencia de fotografía cuando el registro no la contiene.</w:t>
+      </w:r>
+    </w:p>
+    <w:p>
+      <w:pPr>
+        <w:pStyle w:val="ListBullet"/>
+        <w:spacing w:before="0" w:after="40"/>
+        <w:ind w:left="340"/>
+      </w:pPr>
+      <w:r>
+        <w:rPr>
+          <w:rFonts w:ascii="Calibri" w:hAnsi="Calibri"/>
+          <w:sz w:val="22"/>
+        </w:rPr>
+        <w:t>Previsualización de la credencial dentro de la propia plataforma, sin necesidad de abrir una ventana adicional, con opción de imprimirla desde la misma vista.</w:t>
+      </w:r>
+    </w:p>
+    <w:p>
+      <w:pPr>
+        <w:pStyle w:val="ListBullet"/>
+        <w:spacing w:before="0" w:after="40"/>
+        <w:ind w:left="340"/>
+      </w:pPr>
+      <w:r>
+        <w:rPr>
+          <w:rFonts w:ascii="Calibri" w:hAnsi="Calibri"/>
+          <w:sz w:val="22"/>
+        </w:rPr>
+        <w:t>Plantilla adaptable de la credencial: formato A4 apaisado para impresión y visualización optimizada en dispositivos móviles.</w:t>
       </w:r>
     </w:p>
     <w:p>
@@ -5143,21 +4745,21 @@
           <w:rFonts w:ascii="Calibri" w:hAnsi="Calibri"/>
           <w:sz w:val="22"/>
         </w:rPr>
-        <w:t>Persistencia del histórico de acreditaciones por participante (vigentes, vencidas, revocadas).</w:t>
-      </w:r>
-    </w:p>
-    <w:p>
-      <w:pPr>
-        <w:pStyle w:val="ListBullet"/>
-        <w:spacing w:before="0" w:after="40"/>
-        <w:ind w:left="340"/>
-      </w:pPr>
-      <w:r>
-        <w:rPr>
-          <w:rFonts w:ascii="Calibri" w:hAnsi="Calibri"/>
-          <w:sz w:val="22"/>
-        </w:rPr>
-        <w:t>Integración con el módulo 19 (trazabilidad QR) para que cada escaneo en terreno valide la acreditación contra el estado actual.</w:t>
+        <w:t>Persistencia del histórico de acreditaciones por participante (vigentes, vencidas y revocadas).</w:t>
+      </w:r>
+    </w:p>
+    <w:p>
+      <w:pPr>
+        <w:pStyle w:val="ListBullet"/>
+        <w:spacing w:before="0" w:after="40"/>
+        <w:ind w:left="340"/>
+      </w:pPr>
+      <w:r>
+        <w:rPr>
+          <w:rFonts w:ascii="Calibri" w:hAnsi="Calibri"/>
+          <w:sz w:val="22"/>
+        </w:rPr>
+        <w:t>Integración con el módulo 19 (trazabilidad mediante código QR) para que cada escaneo en terreno valide la acreditación contra el estado actual.</w:t>
       </w:r>
     </w:p>
     <w:p>
@@ -5170,7 +4772,7 @@
           <w:color w:val="0F9E87"/>
           <w:sz w:val="28"/>
         </w:rPr>
-        <w:t>25. Centro de Ayuda y Documentación (NUEVO)</w:t>
+        <w:t>25. Centro de Ayuda y Documentación</w:t>
       </w:r>
     </w:p>
     <w:p>
@@ -5183,7 +4785,7 @@
           <w:color w:val="334155"/>
           <w:sz w:val="22"/>
         </w:rPr>
-        <w:t>Base de conocimiento navegable dentro de la plataforma con la documentación operativa, glosario de términos, roles, regiones, recintos y procedimientos del evento.</w:t>
+        <w:t>Permite a los usuarios administradores consultar dentro de la plataforma la documentación operativa del evento, incluyendo glosario de términos, roles, regiones, recintos, hoteles, coordinadores y procedimientos generales.</w:t>
       </w:r>
     </w:p>
     <w:p>
@@ -5208,81 +4810,65 @@
       <w:r>
         <w:rPr>
           <w:rFonts w:ascii="Calibri" w:hAnsi="Calibri"/>
-          <w:b/>
-          <w:sz w:val="22"/>
-        </w:rPr>
-        <w:t>Pestañas filtrables por categoría</w:t>
-      </w:r>
-      <w:r>
-        <w:rPr>
-          <w:rFonts w:ascii="Calibri" w:hAnsi="Calibri"/>
-          <w:sz w:val="22"/>
-        </w:rPr>
-        <w:t>: general, buses, áreas, glosario, roles, regiones, recintos, hoteles, coordinadores.</w:t>
-      </w:r>
-    </w:p>
-    <w:p>
-      <w:pPr>
-        <w:pStyle w:val="ListBullet"/>
-        <w:spacing w:before="0" w:after="40"/>
-        <w:ind w:left="340"/>
-      </w:pPr>
-      <w:r>
-        <w:rPr>
-          <w:rFonts w:ascii="Calibri" w:hAnsi="Calibri"/>
-          <w:b/>
-          <w:sz w:val="22"/>
-        </w:rPr>
-        <w:t>Cuaderno de Cargo Bvan</w:t>
-      </w:r>
-      <w:r>
-        <w:rPr>
-          <w:rFonts w:ascii="Calibri" w:hAnsi="Calibri"/>
-          <w:sz w:val="22"/>
-        </w:rPr>
-        <w:t xml:space="preserve"> integrado como pestaña principal con aproximadamente 97 entradas estructuradas (término, detalles, tags) y soporte trilingüe (español / inglés / portugués) para las etiquetas de categorías.</w:t>
-      </w:r>
-    </w:p>
-    <w:p>
-      <w:pPr>
-        <w:pStyle w:val="ListBullet"/>
-        <w:spacing w:before="0" w:after="40"/>
-        <w:ind w:left="340"/>
-      </w:pPr>
-      <w:r>
-        <w:rPr>
-          <w:rFonts w:ascii="Calibri" w:hAnsi="Calibri"/>
-          <w:sz w:val="22"/>
-        </w:rPr>
-        <w:t>Búsqueda libre dentro del contenido por término, descripción o tag.</w:t>
-      </w:r>
-    </w:p>
-    <w:p>
-      <w:pPr>
-        <w:pStyle w:val="ListBullet"/>
-        <w:spacing w:before="0" w:after="40"/>
-        <w:ind w:left="340"/>
-      </w:pPr>
-      <w:r>
-        <w:rPr>
-          <w:rFonts w:ascii="Calibri" w:hAnsi="Calibri"/>
-          <w:sz w:val="22"/>
-        </w:rPr>
-        <w:t>Visualización del PDF original del Cuaderno de Cargo dentro de la plataforma como referencia descargable.</w:t>
-      </w:r>
-    </w:p>
-    <w:p>
-      <w:pPr>
-        <w:pStyle w:val="ListBullet"/>
-        <w:spacing w:before="0" w:after="40"/>
-        <w:ind w:left="340"/>
-      </w:pPr>
-      <w:r>
-        <w:rPr>
-          <w:rFonts w:ascii="Calibri" w:hAnsi="Calibri"/>
-          <w:sz w:val="22"/>
-        </w:rPr>
-        <w:t>Acceso desde el sidebar principal sin requerir permisos especiales (visible para todos los roles administrativos).</w:t>
+          <w:sz w:val="22"/>
+        </w:rPr>
+        <w:t>Secciones temáticas filtrables: general, buses, áreas, glosario, roles, regiones, recintos, hoteles y coordinadores.</w:t>
+      </w:r>
+    </w:p>
+    <w:p>
+      <w:pPr>
+        <w:pStyle w:val="ListBullet"/>
+        <w:spacing w:before="0" w:after="40"/>
+        <w:ind w:left="340"/>
+      </w:pPr>
+      <w:r>
+        <w:rPr>
+          <w:rFonts w:ascii="Calibri" w:hAnsi="Calibri"/>
+          <w:sz w:val="22"/>
+        </w:rPr>
+        <w:t>Incorporación del Cuaderno de Cargo del evento como sección principal, con cerca de cien entradas estructuradas (término, detalles, etiquetas) y soporte trilingüe en español, inglés y portugués para las etiquetas de categorías.</w:t>
+      </w:r>
+    </w:p>
+    <w:p>
+      <w:pPr>
+        <w:pStyle w:val="ListBullet"/>
+        <w:spacing w:before="0" w:after="40"/>
+        <w:ind w:left="340"/>
+      </w:pPr>
+      <w:r>
+        <w:rPr>
+          <w:rFonts w:ascii="Calibri" w:hAnsi="Calibri"/>
+          <w:sz w:val="22"/>
+        </w:rPr>
+        <w:t>Búsqueda libre dentro del contenido por término, descripción o etiqueta.</w:t>
+      </w:r>
+    </w:p>
+    <w:p>
+      <w:pPr>
+        <w:pStyle w:val="ListBullet"/>
+        <w:spacing w:before="0" w:after="40"/>
+        <w:ind w:left="340"/>
+      </w:pPr>
+      <w:r>
+        <w:rPr>
+          <w:rFonts w:ascii="Calibri" w:hAnsi="Calibri"/>
+          <w:sz w:val="22"/>
+        </w:rPr>
+        <w:t>Visualización del documento original del Cuaderno de Cargo dentro de la plataforma como referencia descargable en formato PDF.</w:t>
+      </w:r>
+    </w:p>
+    <w:p>
+      <w:pPr>
+        <w:pStyle w:val="ListBullet"/>
+        <w:spacing w:before="0" w:after="40"/>
+        <w:ind w:left="340"/>
+      </w:pPr>
+      <w:r>
+        <w:rPr>
+          <w:rFonts w:ascii="Calibri" w:hAnsi="Calibri"/>
+          <w:sz w:val="22"/>
+        </w:rPr>
+        <w:t>Acceso desde el menú principal de la plataforma, disponible para todos los roles administrativos sin requerir permisos especiales.</w:t>
       </w:r>
     </w:p>
     <w:p>
@@ -5309,21 +4895,21 @@
           <w:rFonts w:ascii="Calibri" w:hAnsi="Calibri"/>
           <w:sz w:val="22"/>
         </w:rPr>
-        <w:t>Contenido del Cuaderno de Cargo administrado en archivos versionados dentro del repositorio (frontend/lib/cuadernoCargo.ts) con tipado estricto de entradas.</w:t>
-      </w:r>
-    </w:p>
-    <w:p>
-      <w:pPr>
-        <w:pStyle w:val="ListBullet"/>
-        <w:spacing w:before="0" w:after="40"/>
-        <w:ind w:left="340"/>
-      </w:pPr>
-      <w:r>
-        <w:rPr>
-          <w:rFonts w:ascii="Calibri" w:hAnsi="Calibri"/>
-          <w:sz w:val="22"/>
-        </w:rPr>
-        <w:t>Posibilidad de ampliar las categorías y entradas mediante despliegues sin requerir cambios en la base de datos.</w:t>
+        <w:t>Contenido administrado de forma estructurada y versionada, con validación de campos obligatorios para cada entrada.</w:t>
+      </w:r>
+    </w:p>
+    <w:p>
+      <w:pPr>
+        <w:pStyle w:val="ListBullet"/>
+        <w:spacing w:before="0" w:after="40"/>
+        <w:ind w:left="340"/>
+      </w:pPr>
+      <w:r>
+        <w:rPr>
+          <w:rFonts w:ascii="Calibri" w:hAnsi="Calibri"/>
+          <w:sz w:val="22"/>
+        </w:rPr>
+        <w:t>Posibilidad de ampliar las categorías y entradas en versiones posteriores de la plataforma sin requerir cambios en la base de datos.</w:t>
       </w:r>
     </w:p>
     <w:p>
@@ -5336,7 +4922,7 @@
           <w:color w:val="0F9E87"/>
           <w:sz w:val="28"/>
         </w:rPr>
-        <w:t>26. Inicio Guiado — Onboarding Wizard (NUEVO)</w:t>
+        <w:t>26. Inicio Guiado al Usuario Administrador</w:t>
       </w:r>
     </w:p>
     <w:p>
@@ -5349,7 +4935,7 @@
           <w:color w:val="334155"/>
           <w:sz w:val="22"/>
         </w:rPr>
-        <w:t>Wizard interactivo y personalizado por rol que acompaña al nuevo usuario administrador en sus primeros pasos dentro de la plataforma, recomendando los módulos relevantes según su perfil y objetivos declarados.</w:t>
+        <w:t>Permite acompañar a los nuevos usuarios administradores en sus primeros pasos dentro de la plataforma mediante un recorrido interactivo personalizado por rol, recomendando los módulos relevantes según su perfil y los objetivos declarados.</w:t>
       </w:r>
     </w:p>
     <w:p>
@@ -5374,163 +4960,107 @@
       <w:r>
         <w:rPr>
           <w:rFonts w:ascii="Calibri" w:hAnsi="Calibri"/>
-          <w:b/>
-          <w:sz w:val="22"/>
-        </w:rPr>
-        <w:t>Flujo de 6 pasos</w:t>
-      </w:r>
-      <w:r>
-        <w:rPr>
-          <w:rFonts w:ascii="Calibri" w:hAnsi="Calibri"/>
-          <w:sz w:val="22"/>
-        </w:rPr>
-        <w:t>: Bienvenida → Selección de Rol → Selección de Objetivos → Recomendación de Tareas → Tips y atajos → Pantalla de Completación.</w:t>
-      </w:r>
-    </w:p>
-    <w:p>
-      <w:pPr>
-        <w:pStyle w:val="ListBullet"/>
-        <w:spacing w:before="0" w:after="40"/>
-        <w:ind w:left="340"/>
-      </w:pPr>
-      <w:r>
-        <w:rPr>
-          <w:rFonts w:ascii="Calibri" w:hAnsi="Calibri"/>
-          <w:b/>
-          <w:sz w:val="22"/>
-        </w:rPr>
-        <w:t>6 roles configurados</w:t>
-      </w:r>
-      <w:r>
-        <w:rPr>
-          <w:rFonts w:ascii="Calibri" w:hAnsi="Calibri"/>
-          <w:sz w:val="22"/>
-        </w:rPr>
-        <w:t xml:space="preserve"> con íconos SVG custom (Director / Coordinador de Operaciones / Coordinador de Transporte / Coordinador de Acreditación / Coordinador de Hospedaje / Coordinador de Alimentación, entre otros).</w:t>
-      </w:r>
-    </w:p>
-    <w:p>
-      <w:pPr>
-        <w:pStyle w:val="ListBullet"/>
-        <w:spacing w:before="0" w:after="40"/>
-        <w:ind w:left="340"/>
-      </w:pPr>
-      <w:r>
-        <w:rPr>
-          <w:rFonts w:ascii="Calibri" w:hAnsi="Calibri"/>
-          <w:b/>
-          <w:sz w:val="22"/>
-        </w:rPr>
-        <w:t>Aproximadamente 19 objetivos</w:t>
-      </w:r>
-      <w:r>
-        <w:rPr>
-          <w:rFonts w:ascii="Calibri" w:hAnsi="Calibri"/>
-          <w:sz w:val="22"/>
-        </w:rPr>
-        <w:t xml:space="preserve"> seleccionables con emoji y tags de rol asociados.</w:t>
-      </w:r>
-    </w:p>
-    <w:p>
-      <w:pPr>
-        <w:pStyle w:val="ListBullet"/>
-        <w:spacing w:before="0" w:after="40"/>
-        <w:ind w:left="340"/>
-      </w:pPr>
-      <w:r>
-        <w:rPr>
-          <w:rFonts w:ascii="Calibri" w:hAnsi="Calibri"/>
-          <w:b/>
-          <w:sz w:val="22"/>
-        </w:rPr>
-        <w:t>Aproximadamente 20 tareas</w:t>
-      </w:r>
-      <w:r>
-        <w:rPr>
-          <w:rFonts w:ascii="Calibri" w:hAnsi="Calibri"/>
-          <w:sz w:val="22"/>
-        </w:rPr>
-        <w:t xml:space="preserve"> recomendadas con deep links directos a los módulos correspondientes de la plataforma.</w:t>
-      </w:r>
-    </w:p>
-    <w:p>
-      <w:pPr>
-        <w:pStyle w:val="ListBullet"/>
-        <w:spacing w:before="0" w:after="40"/>
-        <w:ind w:left="340"/>
-      </w:pPr>
-      <w:r>
-        <w:rPr>
-          <w:rFonts w:ascii="Calibri" w:hAnsi="Calibri"/>
-          <w:b/>
-          <w:sz w:val="22"/>
-        </w:rPr>
-        <w:t>Persistencia local del progreso</w:t>
-      </w:r>
-      <w:r>
-        <w:rPr>
-          <w:rFonts w:ascii="Calibri" w:hAnsi="Calibri"/>
-          <w:sz w:val="22"/>
-        </w:rPr>
-        <w:t xml:space="preserve"> (localStorage key "seven.onboarding.state") para reanudar el wizard donde se dejó.</w:t>
-      </w:r>
-    </w:p>
-    <w:p>
-      <w:pPr>
-        <w:pStyle w:val="ListBullet"/>
-        <w:spacing w:before="0" w:after="40"/>
-        <w:ind w:left="340"/>
-      </w:pPr>
-      <w:r>
-        <w:rPr>
-          <w:rFonts w:ascii="Calibri" w:hAnsi="Calibri"/>
-          <w:b/>
-          <w:sz w:val="22"/>
-        </w:rPr>
-        <w:t>Animaciones y efectos</w:t>
-      </w:r>
-      <w:r>
-        <w:rPr>
-          <w:rFonts w:ascii="Calibri" w:hAnsi="Calibri"/>
-          <w:sz w:val="22"/>
-        </w:rPr>
-        <w:t>: partículas flotantes, shimmer en gradientes, pulse rings, confetti al completar (60 piezas animadas), bounce-in para tarjetas, sparkles, stagger en listas.</w:t>
-      </w:r>
-    </w:p>
-    <w:p>
-      <w:pPr>
-        <w:pStyle w:val="ListBullet"/>
-        <w:spacing w:before="0" w:after="40"/>
-        <w:ind w:left="340"/>
-      </w:pPr>
-      <w:r>
-        <w:rPr>
-          <w:rFonts w:ascii="Calibri" w:hAnsi="Calibri"/>
-          <w:b/>
-          <w:sz w:val="22"/>
-        </w:rPr>
-        <w:t>Step indicator clickeable</w:t>
-      </w:r>
-      <w:r>
-        <w:rPr>
-          <w:rFonts w:ascii="Calibri" w:hAnsi="Calibri"/>
-          <w:sz w:val="22"/>
-        </w:rPr>
-        <w:t xml:space="preserve"> con animación pulse-ring sobre el paso activo.</w:t>
-      </w:r>
-    </w:p>
-    <w:p>
-      <w:pPr>
-        <w:pStyle w:val="ListBullet"/>
-        <w:spacing w:before="0" w:after="40"/>
-        <w:ind w:left="340"/>
-      </w:pPr>
-      <w:r>
-        <w:rPr>
-          <w:rFonts w:ascii="Calibri" w:hAnsi="Calibri"/>
-          <w:sz w:val="22"/>
-        </w:rPr>
-        <w:t>Estimación visual del tiempo restante para completar el wizard.</w:t>
+          <w:sz w:val="22"/>
+        </w:rPr>
+        <w:t>Recorrido estructurado en seis pasos: bienvenida, selección del rol del usuario, selección de objetivos, recomendación de tareas, sugerencias y atajos, y pantalla de finalización.</w:t>
+      </w:r>
+    </w:p>
+    <w:p>
+      <w:pPr>
+        <w:pStyle w:val="ListBullet"/>
+        <w:spacing w:before="0" w:after="40"/>
+        <w:ind w:left="340"/>
+      </w:pPr>
+      <w:r>
+        <w:rPr>
+          <w:rFonts w:ascii="Calibri" w:hAnsi="Calibri"/>
+          <w:sz w:val="22"/>
+        </w:rPr>
+        <w:t>Seis roles configurados (Director, Coordinador de Operaciones, Coordinador de Transporte, Coordinador de Acreditación, Coordinador de Hospedaje y Coordinador de Alimentación), cada uno con su ícono representativo.</w:t>
+      </w:r>
+    </w:p>
+    <w:p>
+      <w:pPr>
+        <w:pStyle w:val="ListBullet"/>
+        <w:spacing w:before="0" w:after="40"/>
+        <w:ind w:left="340"/>
+      </w:pPr>
+      <w:r>
+        <w:rPr>
+          <w:rFonts w:ascii="Calibri" w:hAnsi="Calibri"/>
+          <w:sz w:val="22"/>
+        </w:rPr>
+        <w:t>Listado de objetivos seleccionables por el usuario, con etiquetas que indican el rol al que aplican.</w:t>
+      </w:r>
+    </w:p>
+    <w:p>
+      <w:pPr>
+        <w:pStyle w:val="ListBullet"/>
+        <w:spacing w:before="0" w:after="40"/>
+        <w:ind w:left="340"/>
+      </w:pPr>
+      <w:r>
+        <w:rPr>
+          <w:rFonts w:ascii="Calibri" w:hAnsi="Calibri"/>
+          <w:sz w:val="22"/>
+        </w:rPr>
+        <w:t>Listado de tareas recomendadas con enlaces directos a los módulos correspondientes de la plataforma.</w:t>
+      </w:r>
+    </w:p>
+    <w:p>
+      <w:pPr>
+        <w:pStyle w:val="ListBullet"/>
+        <w:spacing w:before="0" w:after="40"/>
+        <w:ind w:left="340"/>
+      </w:pPr>
+      <w:r>
+        <w:rPr>
+          <w:rFonts w:ascii="Calibri" w:hAnsi="Calibri"/>
+          <w:sz w:val="22"/>
+        </w:rPr>
+        <w:t>Persistencia del progreso en el navegador del usuario para permitir reanudar el recorrido en una sesión posterior.</w:t>
+      </w:r>
+    </w:p>
+    <w:p>
+      <w:pPr>
+        <w:pStyle w:val="ListBullet"/>
+        <w:spacing w:before="0" w:after="40"/>
+        <w:ind w:left="340"/>
+      </w:pPr>
+      <w:r>
+        <w:rPr>
+          <w:rFonts w:ascii="Calibri" w:hAnsi="Calibri"/>
+          <w:sz w:val="22"/>
+        </w:rPr>
+        <w:t>Animaciones y elementos visuales (partículas, transiciones, indicadores de paso activo, efecto de confeti al completar) que entregan una experiencia diferenciada respecto a un manual estático.</w:t>
+      </w:r>
+    </w:p>
+    <w:p>
+      <w:pPr>
+        <w:pStyle w:val="ListBullet"/>
+        <w:spacing w:before="0" w:after="40"/>
+        <w:ind w:left="340"/>
+      </w:pPr>
+      <w:r>
+        <w:rPr>
+          <w:rFonts w:ascii="Calibri" w:hAnsi="Calibri"/>
+          <w:sz w:val="22"/>
+        </w:rPr>
+        <w:t>Indicadores de paso clickeables que permiten navegar entre las etapas del recorrido.</w:t>
+      </w:r>
+    </w:p>
+    <w:p>
+      <w:pPr>
+        <w:pStyle w:val="ListBullet"/>
+        <w:spacing w:before="0" w:after="40"/>
+        <w:ind w:left="340"/>
+      </w:pPr>
+      <w:r>
+        <w:rPr>
+          <w:rFonts w:ascii="Calibri" w:hAnsi="Calibri"/>
+          <w:sz w:val="22"/>
+        </w:rPr>
+        <w:t>Estimación visual del tiempo restante para completar el recorrido.</w:t>
       </w:r>
     </w:p>
     <w:p>
@@ -5557,35 +5087,35 @@
           <w:rFonts w:ascii="Calibri" w:hAnsi="Calibri"/>
           <w:sz w:val="22"/>
         </w:rPr>
-        <w:t>Persistencia del estado del wizard en localStorage para continuidad entre sesiones del navegador.</w:t>
-      </w:r>
-    </w:p>
-    <w:p>
-      <w:pPr>
-        <w:pStyle w:val="ListBullet"/>
-        <w:spacing w:before="0" w:after="40"/>
-        <w:ind w:left="340"/>
-      </w:pPr>
-      <w:r>
-        <w:rPr>
-          <w:rFonts w:ascii="Calibri" w:hAnsi="Calibri"/>
-          <w:sz w:val="22"/>
-        </w:rPr>
-        <w:t>Posibilidad de restablecer el wizard manualmente desde la propia pantalla.</w:t>
-      </w:r>
-    </w:p>
-    <w:p>
-      <w:pPr>
-        <w:pStyle w:val="ListBullet"/>
-        <w:spacing w:before="0" w:after="40"/>
-        <w:ind w:left="340"/>
-      </w:pPr>
-      <w:r>
-        <w:rPr>
-          <w:rFonts w:ascii="Calibri" w:hAnsi="Calibri"/>
-          <w:sz w:val="22"/>
-        </w:rPr>
-        <w:t>Disponible para todos los usuarios administradores desde el menú lateral ("Inicio guiado").</w:t>
+        <w:t>Persistencia del estado del recorrido en el navegador del usuario para continuidad entre sesiones.</w:t>
+      </w:r>
+    </w:p>
+    <w:p>
+      <w:pPr>
+        <w:pStyle w:val="ListBullet"/>
+        <w:spacing w:before="0" w:after="40"/>
+        <w:ind w:left="340"/>
+      </w:pPr>
+      <w:r>
+        <w:rPr>
+          <w:rFonts w:ascii="Calibri" w:hAnsi="Calibri"/>
+          <w:sz w:val="22"/>
+        </w:rPr>
+        <w:t>Posibilidad de restablecer el recorrido manualmente desde la propia pantalla.</w:t>
+      </w:r>
+    </w:p>
+    <w:p>
+      <w:pPr>
+        <w:pStyle w:val="ListBullet"/>
+        <w:spacing w:before="0" w:after="40"/>
+        <w:ind w:left="340"/>
+      </w:pPr>
+      <w:r>
+        <w:rPr>
+          <w:rFonts w:ascii="Calibri" w:hAnsi="Calibri"/>
+          <w:sz w:val="22"/>
+        </w:rPr>
+        <w:t>Acceso para todos los usuarios administradores desde el menú principal de la plataforma.</w:t>
       </w:r>
     </w:p>
     <w:p>
@@ -5598,7 +5128,7 @@
           <w:color w:val="0F9E87"/>
           <w:sz w:val="28"/>
         </w:rPr>
-        <w:t>27. Operatividad Diaria del Transporte (NUEVO)</w:t>
+        <w:t>27. Operatividad Diaria del Transporte</w:t>
       </w:r>
     </w:p>
     <w:p>
@@ -5611,7 +5141,7 @@
           <w:color w:val="334155"/>
           <w:sz w:val="22"/>
         </w:rPr>
-        <w:t>Pantalla de operación diaria del módulo de transporte que consolida en una sola vista la planificación, asignación y seguimiento de los viajes del día, con herramientas de auto-asignación y carga masiva.</w:t>
+        <w:t>Permite consolidar en una sola pantalla la planificación, asignación y seguimiento de los viajes del día, entregando al equipo operativo las herramientas necesarias para administrar la jornada de transporte de manera eficiente.</w:t>
       </w:r>
     </w:p>
     <w:p>
@@ -5636,127 +5166,79 @@
       <w:r>
         <w:rPr>
           <w:rFonts w:ascii="Calibri" w:hAnsi="Calibri"/>
-          <w:b/>
-          <w:sz w:val="22"/>
-        </w:rPr>
-        <w:t>Vista consolidada del día</w:t>
-      </w:r>
-      <w:r>
-        <w:rPr>
-          <w:rFonts w:ascii="Calibri" w:hAnsi="Calibri"/>
-          <w:sz w:val="22"/>
-        </w:rPr>
-        <w:t xml:space="preserve"> con todos los viajes en estados activos (REQUESTED, SCHEDULED, EN_ROUTE, PICKED_UP) y sus indicadores clave.</w:t>
-      </w:r>
-    </w:p>
-    <w:p>
-      <w:pPr>
-        <w:pStyle w:val="ListBullet"/>
-        <w:spacing w:before="0" w:after="40"/>
-        <w:ind w:left="340"/>
-      </w:pPr>
-      <w:r>
-        <w:rPr>
-          <w:rFonts w:ascii="Calibri" w:hAnsi="Calibri"/>
-          <w:b/>
-          <w:sz w:val="22"/>
-        </w:rPr>
-        <w:t>Auto-asignación de conductores</w:t>
-      </w:r>
-      <w:r>
-        <w:rPr>
-          <w:rFonts w:ascii="Calibri" w:hAnsi="Calibri"/>
-          <w:sz w:val="22"/>
-        </w:rPr>
-        <w:t>: algoritmo que asigna automáticamente al conductor óptimo considerando capacidad del vehículo, disponibilidad horaria y carga acumulada del día.</w:t>
-      </w:r>
-    </w:p>
-    <w:p>
-      <w:pPr>
-        <w:pStyle w:val="ListBullet"/>
-        <w:spacing w:before="0" w:after="40"/>
-        <w:ind w:left="340"/>
-      </w:pPr>
-      <w:r>
-        <w:rPr>
-          <w:rFonts w:ascii="Calibri" w:hAnsi="Calibri"/>
-          <w:b/>
-          <w:sz w:val="22"/>
-        </w:rPr>
-        <w:t>Descarga de plantilla Excel</w:t>
-      </w:r>
-      <w:r>
-        <w:rPr>
-          <w:rFonts w:ascii="Calibri" w:hAnsi="Calibri"/>
-          <w:sz w:val="22"/>
-        </w:rPr>
-        <w:t xml:space="preserve"> (25 columnas) para la carga masiva del transporte del día, con campos pre-llenados de ejemplo y celdas vacías para los campos que completa el sistema (conductor, teléfono, patente).</w:t>
-      </w:r>
-    </w:p>
-    <w:p>
-      <w:pPr>
-        <w:pStyle w:val="ListBullet"/>
-        <w:spacing w:before="0" w:after="40"/>
-        <w:ind w:left="340"/>
-      </w:pPr>
-      <w:r>
-        <w:rPr>
-          <w:rFonts w:ascii="Calibri" w:hAnsi="Calibri"/>
-          <w:b/>
-          <w:sz w:val="22"/>
-        </w:rPr>
-        <w:t>Filtrado avanzado</w:t>
-      </w:r>
-      <w:r>
-        <w:rPr>
-          <w:rFonts w:ascii="Calibri" w:hAnsi="Calibri"/>
-          <w:sz w:val="22"/>
-        </w:rPr>
-        <w:t xml:space="preserve"> por estado, conductor, vehículo, ruta y franja horaria.</w:t>
-      </w:r>
-    </w:p>
-    <w:p>
-      <w:pPr>
-        <w:pStyle w:val="ListBullet"/>
-        <w:spacing w:before="0" w:after="40"/>
-        <w:ind w:left="340"/>
-      </w:pPr>
-      <w:r>
-        <w:rPr>
-          <w:rFonts w:ascii="Calibri" w:hAnsi="Calibri"/>
-          <w:b/>
-          <w:sz w:val="22"/>
-        </w:rPr>
-        <w:t>Edición masiva</w:t>
-      </w:r>
-      <w:r>
-        <w:rPr>
-          <w:rFonts w:ascii="Calibri" w:hAnsi="Calibri"/>
-          <w:sz w:val="22"/>
-        </w:rPr>
-        <w:t xml:space="preserve"> sobre la selección múltiple para asignar o reasignar conductores en lote.</w:t>
-      </w:r>
-    </w:p>
-    <w:p>
-      <w:pPr>
-        <w:pStyle w:val="ListBullet"/>
-        <w:spacing w:before="0" w:after="40"/>
-        <w:ind w:left="340"/>
-      </w:pPr>
-      <w:r>
-        <w:rPr>
-          <w:rFonts w:ascii="Calibri" w:hAnsi="Calibri"/>
-          <w:b/>
-          <w:sz w:val="22"/>
-        </w:rPr>
-        <w:t>Indicadores agregados</w:t>
-      </w:r>
-      <w:r>
-        <w:rPr>
-          <w:rFonts w:ascii="Calibri" w:hAnsi="Calibri"/>
-          <w:sz w:val="22"/>
-        </w:rPr>
-        <w:t xml:space="preserve"> con totales de viajes, viajes asignados / sin asignar y porcentaje de cobertura del día.</w:t>
+          <w:sz w:val="22"/>
+        </w:rPr>
+        <w:t>Vista consolidada del día con todos los viajes en estados activos (solicitado, programado, en ruta y recogido) y sus indicadores clave.</w:t>
+      </w:r>
+    </w:p>
+    <w:p>
+      <w:pPr>
+        <w:pStyle w:val="ListBullet"/>
+        <w:spacing w:before="0" w:after="40"/>
+        <w:ind w:left="340"/>
+      </w:pPr>
+      <w:r>
+        <w:rPr>
+          <w:rFonts w:ascii="Calibri" w:hAnsi="Calibri"/>
+          <w:sz w:val="22"/>
+        </w:rPr>
+        <w:t>Asignación automática de conductores con criterios operativos: capacidad del vehículo, disponibilidad horaria y carga acumulada de cada conductor en la jornada.</w:t>
+      </w:r>
+    </w:p>
+    <w:p>
+      <w:pPr>
+        <w:pStyle w:val="ListBullet"/>
+        <w:spacing w:before="0" w:after="40"/>
+        <w:ind w:left="340"/>
+      </w:pPr>
+      <w:r>
+        <w:rPr>
+          <w:rFonts w:ascii="Calibri" w:hAnsi="Calibri"/>
+          <w:sz w:val="22"/>
+        </w:rPr>
+        <w:t>Descarga de una plantilla en formato XLSX con todos los campos necesarios para la carga masiva del transporte del día, incluyendo filas de ejemplo y campos vacíos para los datos que completa el sistema (conductor, teléfono, patente).</w:t>
+      </w:r>
+    </w:p>
+    <w:p>
+      <w:pPr>
+        <w:pStyle w:val="ListBullet"/>
+        <w:spacing w:before="0" w:after="40"/>
+        <w:ind w:left="340"/>
+      </w:pPr>
+      <w:r>
+        <w:rPr>
+          <w:rFonts w:ascii="Calibri" w:hAnsi="Calibri"/>
+          <w:sz w:val="22"/>
+        </w:rPr>
+        <w:t>Filtrado del listado por estado, conductor, vehículo, ruta y franja horaria.</w:t>
+      </w:r>
+    </w:p>
+    <w:p>
+      <w:pPr>
+        <w:pStyle w:val="ListBullet"/>
+        <w:spacing w:before="0" w:after="40"/>
+        <w:ind w:left="340"/>
+      </w:pPr>
+      <w:r>
+        <w:rPr>
+          <w:rFonts w:ascii="Calibri" w:hAnsi="Calibri"/>
+          <w:sz w:val="22"/>
+        </w:rPr>
+        <w:t>Edición masiva sobre selección múltiple para asignar o reasignar conductores en lote.</w:t>
+      </w:r>
+    </w:p>
+    <w:p>
+      <w:pPr>
+        <w:pStyle w:val="ListBullet"/>
+        <w:spacing w:before="0" w:after="40"/>
+        <w:ind w:left="340"/>
+      </w:pPr>
+      <w:r>
+        <w:rPr>
+          <w:rFonts w:ascii="Calibri" w:hAnsi="Calibri"/>
+          <w:sz w:val="22"/>
+        </w:rPr>
+        <w:t>Indicadores agregados con el total de viajes del día, viajes asignados, viajes sin asignar y porcentaje de cobertura.</w:t>
       </w:r>
     </w:p>
     <w:p>
@@ -5783,21 +5265,21 @@
           <w:rFonts w:ascii="Calibri" w:hAnsi="Calibri"/>
           <w:sz w:val="22"/>
         </w:rPr>
-        <w:t>Carga masiva mediante archivo XLSX usando la plantilla descargable, con validación previa de cada fila y reporte de errores.</w:t>
-      </w:r>
-    </w:p>
-    <w:p>
-      <w:pPr>
-        <w:pStyle w:val="ListBullet"/>
-        <w:spacing w:before="0" w:after="40"/>
-        <w:ind w:left="340"/>
-      </w:pPr>
-      <w:r>
-        <w:rPr>
-          <w:rFonts w:ascii="Calibri" w:hAnsi="Calibri"/>
-          <w:sz w:val="22"/>
-        </w:rPr>
-        <w:t>Persistencia de la auto-asignación en la bitácora de cada viaje, identificando que la asignación fue automática.</w:t>
+        <w:t>Carga masiva mediante archivo XLSX usando la plantilla descargable, con validación previa de cada fila y reporte de errores antes de la confirmación.</w:t>
+      </w:r>
+    </w:p>
+    <w:p>
+      <w:pPr>
+        <w:pStyle w:val="ListBullet"/>
+        <w:spacing w:before="0" w:after="40"/>
+        <w:ind w:left="340"/>
+      </w:pPr>
+      <w:r>
+        <w:rPr>
+          <w:rFonts w:ascii="Calibri" w:hAnsi="Calibri"/>
+          <w:sz w:val="22"/>
+        </w:rPr>
+        <w:t>Persistencia de la asignación automática en la bitácora de cada viaje, identificando que la operación fue ejecutada por la plataforma.</w:t>
       </w:r>
     </w:p>
     <w:p>
@@ -5824,7 +5306,7 @@
           <w:color w:val="0F9E87"/>
           <w:sz w:val="28"/>
         </w:rPr>
-        <w:t>28. Acciones de SofIA — Auditoría de la IA (NUEVO)</w:t>
+        <w:t>28. Registro de Acciones del Asistente de Inteligencia Artificial</w:t>
       </w:r>
     </w:p>
     <w:p>
@@ -5837,7 +5319,7 @@
           <w:color w:val="334155"/>
           <w:sz w:val="22"/>
         </w:rPr>
-        <w:t>Pantalla de auditoría que registra de forma completa cada operación que el asistente conversacional SofIA ejecuta sobre la plataforma, garantizando trazabilidad, control y rendición de cuentas sobre el accionar de la inteligencia artificial.</w:t>
+        <w:t>Permite auditar de forma completa cada operación que el asistente de inteligencia artificial (SofIA) ejecuta sobre la plataforma, garantizando la trazabilidad, el control y la rendición de cuentas sobre el accionar de la inteligencia artificial.</w:t>
       </w:r>
     </w:p>
     <w:p>
@@ -5862,105 +5344,65 @@
       <w:r>
         <w:rPr>
           <w:rFonts w:ascii="Calibri" w:hAnsi="Calibri"/>
-          <w:b/>
-          <w:sz w:val="22"/>
-        </w:rPr>
-        <w:t>Registro histórico</w:t>
-      </w:r>
-      <w:r>
-        <w:rPr>
-          <w:rFonts w:ascii="Calibri" w:hAnsi="Calibri"/>
-          <w:sz w:val="22"/>
-        </w:rPr>
-        <w:t xml:space="preserve"> de cada herramienta ejecutada por SofIA: viajes creados, modificados o cancelados, hoteles asignados, premiaciones programadas, cupones publicados, notificaciones enviadas, entre otros.</w:t>
-      </w:r>
-    </w:p>
-    <w:p>
-      <w:pPr>
-        <w:pStyle w:val="ListBullet"/>
-        <w:spacing w:before="0" w:after="40"/>
-        <w:ind w:left="340"/>
-      </w:pPr>
-      <w:r>
-        <w:rPr>
-          <w:rFonts w:ascii="Calibri" w:hAnsi="Calibri"/>
-          <w:b/>
-          <w:sz w:val="22"/>
-        </w:rPr>
-        <w:t>Filtros por tipo de acción</w:t>
-      </w:r>
-      <w:r>
-        <w:rPr>
-          <w:rFonts w:ascii="Calibri" w:hAnsi="Calibri"/>
-          <w:sz w:val="22"/>
-        </w:rPr>
-        <w:t xml:space="preserve"> (≈53 herramientas mapeadas), por fecha, por usuario que originó la consulta y por estado de la ejecución (éxito / error).</w:t>
-      </w:r>
-    </w:p>
-    <w:p>
-      <w:pPr>
-        <w:pStyle w:val="ListBullet"/>
-        <w:spacing w:before="0" w:after="40"/>
-        <w:ind w:left="340"/>
-      </w:pPr>
-      <w:r>
-        <w:rPr>
-          <w:rFonts w:ascii="Calibri" w:hAnsi="Calibri"/>
-          <w:b/>
-          <w:sz w:val="22"/>
-        </w:rPr>
-        <w:t>Detalle expandible de cada acción</w:t>
-      </w:r>
-      <w:r>
-        <w:rPr>
-          <w:rFonts w:ascii="Calibri" w:hAnsi="Calibri"/>
-          <w:sz w:val="22"/>
-        </w:rPr>
-        <w:t xml:space="preserve"> con los argumentos enviados, la respuesta devuelta por la plataforma y la conversación original que originó la operación.</w:t>
-      </w:r>
-    </w:p>
-    <w:p>
-      <w:pPr>
-        <w:pStyle w:val="ListBullet"/>
-        <w:spacing w:before="0" w:after="40"/>
-        <w:ind w:left="340"/>
-      </w:pPr>
-      <w:r>
-        <w:rPr>
-          <w:rFonts w:ascii="Calibri" w:hAnsi="Calibri"/>
-          <w:b/>
-          <w:sz w:val="22"/>
-        </w:rPr>
-        <w:t>Indicadores agregados</w:t>
-      </w:r>
-      <w:r>
-        <w:rPr>
-          <w:rFonts w:ascii="Calibri" w:hAnsi="Calibri"/>
-          <w:sz w:val="22"/>
-        </w:rPr>
-        <w:t xml:space="preserve"> del uso de la IA: acciones por día, acciones por tipo, ratio de éxito y herramientas más utilizadas.</w:t>
-      </w:r>
-    </w:p>
-    <w:p>
-      <w:pPr>
-        <w:pStyle w:val="ListBullet"/>
-        <w:spacing w:before="0" w:after="40"/>
-        <w:ind w:left="340"/>
-      </w:pPr>
-      <w:r>
-        <w:rPr>
-          <w:rFonts w:ascii="Calibri" w:hAnsi="Calibri"/>
-          <w:b/>
-          <w:sz w:val="22"/>
-        </w:rPr>
-        <w:t>Exportación a XLSX</w:t>
-      </w:r>
-      <w:r>
-        <w:rPr>
-          <w:rFonts w:ascii="Calibri" w:hAnsi="Calibri"/>
-          <w:sz w:val="22"/>
-        </w:rPr>
-        <w:t xml:space="preserve"> para análisis offline y reportería ejecutiva.</w:t>
+          <w:sz w:val="22"/>
+        </w:rPr>
+        <w:t>Registro histórico de cada operación ejecutada por el asistente: viajes creados, modificados o cancelados, hoteles asignados, premiaciones programadas, cupones publicados, notificaciones enviadas, entre otras.</w:t>
+      </w:r>
+    </w:p>
+    <w:p>
+      <w:pPr>
+        <w:pStyle w:val="ListBullet"/>
+        <w:spacing w:before="0" w:after="40"/>
+        <w:ind w:left="340"/>
+      </w:pPr>
+      <w:r>
+        <w:rPr>
+          <w:rFonts w:ascii="Calibri" w:hAnsi="Calibri"/>
+          <w:sz w:val="22"/>
+        </w:rPr>
+        <w:t>Filtrado del listado por tipo de operación, por fecha, por usuario que originó la consulta y por estado de la ejecución (exitosa o con error).</w:t>
+      </w:r>
+    </w:p>
+    <w:p>
+      <w:pPr>
+        <w:pStyle w:val="ListBullet"/>
+        <w:spacing w:before="0" w:after="40"/>
+        <w:ind w:left="340"/>
+      </w:pPr>
+      <w:r>
+        <w:rPr>
+          <w:rFonts w:ascii="Calibri" w:hAnsi="Calibri"/>
+          <w:sz w:val="22"/>
+        </w:rPr>
+        <w:t>Detalle expandible de cada operación con los parámetros enviados, la respuesta devuelta por la plataforma y la consulta original que la originó.</w:t>
+      </w:r>
+    </w:p>
+    <w:p>
+      <w:pPr>
+        <w:pStyle w:val="ListBullet"/>
+        <w:spacing w:before="0" w:after="40"/>
+        <w:ind w:left="340"/>
+      </w:pPr>
+      <w:r>
+        <w:rPr>
+          <w:rFonts w:ascii="Calibri" w:hAnsi="Calibri"/>
+          <w:sz w:val="22"/>
+        </w:rPr>
+        <w:t>Indicadores agregados del uso del asistente: operaciones por día, operaciones por tipo, porcentaje de éxito y funciones más utilizadas.</w:t>
+      </w:r>
+    </w:p>
+    <w:p>
+      <w:pPr>
+        <w:pStyle w:val="ListBullet"/>
+        <w:spacing w:before="0" w:after="40"/>
+        <w:ind w:left="340"/>
+      </w:pPr>
+      <w:r>
+        <w:rPr>
+          <w:rFonts w:ascii="Calibri" w:hAnsi="Calibri"/>
+          <w:sz w:val="22"/>
+        </w:rPr>
+        <w:t>Exportación del registro a formato XLSX para su posterior análisis o reportería ejecutiva.</w:t>
       </w:r>
     </w:p>
     <w:p>
@@ -5987,21 +5429,21 @@
           <w:rFonts w:ascii="Calibri" w:hAnsi="Calibri"/>
           <w:sz w:val="22"/>
         </w:rPr>
-        <w:t>Persistencia automática en la base de datos de cada invocación de herramienta del asistente, con argumentos sanitizados (sin strings vacíos que generen errores de UUID) y respuesta completa.</w:t>
-      </w:r>
-    </w:p>
-    <w:p>
-      <w:pPr>
-        <w:pStyle w:val="ListBullet"/>
-        <w:spacing w:before="0" w:after="40"/>
-        <w:ind w:left="340"/>
-      </w:pPr>
-      <w:r>
-        <w:rPr>
-          <w:rFonts w:ascii="Calibri" w:hAnsi="Calibri"/>
-          <w:sz w:val="22"/>
-        </w:rPr>
-        <w:t>Asociación de cada acción con la conversación de origen para facilitar la auditoría contextual.</w:t>
+        <w:t>Persistencia automática en la base de datos de cada operación ejecutada por el asistente, con los parámetros validados y la respuesta completa de la plataforma.</w:t>
+      </w:r>
+    </w:p>
+    <w:p>
+      <w:pPr>
+        <w:pStyle w:val="ListBullet"/>
+        <w:spacing w:before="0" w:after="40"/>
+        <w:ind w:left="340"/>
+      </w:pPr>
+      <w:r>
+        <w:rPr>
+          <w:rFonts w:ascii="Calibri" w:hAnsi="Calibri"/>
+          <w:sz w:val="22"/>
+        </w:rPr>
+        <w:t>Asociación de cada operación con la consulta de origen para facilitar la auditoría contextual del comportamiento del asistente.</w:t>
       </w:r>
     </w:p>
     <w:p>
@@ -6054,94 +5496,49 @@
           <w:rFonts w:ascii="Calibri" w:hAnsi="Calibri"/>
           <w:sz w:val="22"/>
         </w:rPr>
-        <w:t xml:space="preserve">Capa de servicios desarrollada con </w:t>
-      </w:r>
-      <w:r>
-        <w:rPr>
-          <w:rFonts w:ascii="Calibri" w:hAnsi="Calibri"/>
-          <w:b/>
-          <w:sz w:val="22"/>
-        </w:rPr>
-        <w:t>NestJS</w:t>
-      </w:r>
-      <w:r>
-        <w:rPr>
-          <w:rFonts w:ascii="Calibri" w:hAnsi="Calibri"/>
-          <w:sz w:val="22"/>
-        </w:rPr>
-        <w:t xml:space="preserve"> sobre </w:t>
-      </w:r>
-      <w:r>
-        <w:rPr>
-          <w:rFonts w:ascii="Calibri" w:hAnsi="Calibri"/>
-          <w:b/>
-          <w:sz w:val="22"/>
-        </w:rPr>
-        <w:t>Node.js</w:t>
-      </w:r>
-      <w:r>
-        <w:rPr>
-          <w:rFonts w:ascii="Calibri" w:hAnsi="Calibri"/>
-          <w:sz w:val="22"/>
-        </w:rPr>
-        <w:t xml:space="preserve"> y </w:t>
-      </w:r>
-      <w:r>
-        <w:rPr>
-          <w:rFonts w:ascii="Calibri" w:hAnsi="Calibri"/>
-          <w:b/>
-          <w:sz w:val="22"/>
-        </w:rPr>
-        <w:t>TypeScript</w:t>
-      </w:r>
-      <w:r>
-        <w:rPr>
-          <w:rFonts w:ascii="Calibri" w:hAnsi="Calibri"/>
-          <w:sz w:val="22"/>
-        </w:rPr>
-        <w:t>, que asegura una arquitectura modular, mantenible y escalable.</w:t>
-      </w:r>
-    </w:p>
-    <w:p>
-      <w:pPr>
-        <w:pStyle w:val="ListBullet"/>
-        <w:spacing w:before="0" w:after="40"/>
-        <w:ind w:left="340"/>
-      </w:pPr>
-      <w:r>
-        <w:rPr>
-          <w:rFonts w:ascii="Calibri" w:hAnsi="Calibri"/>
-          <w:sz w:val="22"/>
-        </w:rPr>
-        <w:t>Exposición de los servicios mediante una API REST estándar, con validación estricta de entrada (class-validator) y autenticación basada en tokens JWT seguros emitidos por Supabase Auth.</w:t>
-      </w:r>
-    </w:p>
-    <w:p>
-      <w:pPr>
-        <w:pStyle w:val="ListBullet"/>
-        <w:spacing w:before="0" w:after="40"/>
-        <w:ind w:left="340"/>
-      </w:pPr>
-      <w:r>
-        <w:rPr>
-          <w:rFonts w:ascii="Calibri" w:hAnsi="Calibri"/>
-          <w:sz w:val="22"/>
-        </w:rPr>
-        <w:t>Transmisión de eventos en tiempo real (ubicaciones GPS, notificaciones, mensajería) mediante Server-Sent Events (SSE) y canales realtime de Supabase, para soportar la operación en campo.</w:t>
-      </w:r>
-    </w:p>
-    <w:p>
-      <w:pPr>
-        <w:pStyle w:val="ListBullet"/>
-        <w:spacing w:before="0" w:after="40"/>
-        <w:ind w:left="340"/>
-      </w:pPr>
-      <w:r>
-        <w:rPr>
-          <w:rFonts w:ascii="Calibri" w:hAnsi="Calibri"/>
-          <w:sz w:val="22"/>
-        </w:rPr>
-        <w:t>Integración con servicios externos para funcionalidades complementarias: Google Maps (geocodificación, places, distance matrix), AviationStack (tracking de vuelos), OpenAI Responses API (asistente SofIA con tool use) y Supabase Storage (almacenamiento de archivos).</w:t>
+        <w:t>Capa de servicios desarrollada con tecnologías modernas basadas en Node.js y TypeScript, que aseguran una arquitectura modular, mantenible y escalable.</w:t>
+      </w:r>
+    </w:p>
+    <w:p>
+      <w:pPr>
+        <w:pStyle w:val="ListBullet"/>
+        <w:spacing w:before="0" w:after="40"/>
+        <w:ind w:left="340"/>
+      </w:pPr>
+      <w:r>
+        <w:rPr>
+          <w:rFonts w:ascii="Calibri" w:hAnsi="Calibri"/>
+          <w:sz w:val="22"/>
+        </w:rPr>
+        <w:t>Exposición de los servicios mediante una interfaz estándar de integración, con validación estricta de entrada y autenticación basada en tokens seguros.</w:t>
+      </w:r>
+    </w:p>
+    <w:p>
+      <w:pPr>
+        <w:pStyle w:val="ListBullet"/>
+        <w:spacing w:before="0" w:after="40"/>
+        <w:ind w:left="340"/>
+      </w:pPr>
+      <w:r>
+        <w:rPr>
+          <w:rFonts w:ascii="Calibri" w:hAnsi="Calibri"/>
+          <w:sz w:val="22"/>
+        </w:rPr>
+        <w:t>Transmisión de eventos en tiempo real (ubicaciones GPS, notificaciones, mensajería) para soportar la operación en campo.</w:t>
+      </w:r>
+    </w:p>
+    <w:p>
+      <w:pPr>
+        <w:pStyle w:val="ListBullet"/>
+        <w:spacing w:before="0" w:after="40"/>
+        <w:ind w:left="340"/>
+      </w:pPr>
+      <w:r>
+        <w:rPr>
+          <w:rFonts w:ascii="Calibri" w:hAnsi="Calibri"/>
+          <w:sz w:val="22"/>
+        </w:rPr>
+        <w:t>Integración con servicios externos para funcionalidades complementarias: mapas y geocodificación, seguimiento de vuelos, inteligencia artificial y almacenamiento de archivos.</w:t>
       </w:r>
     </w:p>
     <w:p>
@@ -6182,66 +5579,21 @@
           <w:rFonts w:ascii="Calibri" w:hAnsi="Calibri"/>
           <w:sz w:val="22"/>
         </w:rPr>
-        <w:t xml:space="preserve">Plataforma de administración desarrollada con </w:t>
-      </w:r>
-      <w:r>
-        <w:rPr>
-          <w:rFonts w:ascii="Calibri" w:hAnsi="Calibri"/>
-          <w:b/>
-          <w:sz w:val="22"/>
-        </w:rPr>
-        <w:t>Next.js 14 (App Router)</w:t>
-      </w:r>
-      <w:r>
-        <w:rPr>
-          <w:rFonts w:ascii="Calibri" w:hAnsi="Calibri"/>
-          <w:sz w:val="22"/>
-        </w:rPr>
-        <w:t xml:space="preserve"> sobre </w:t>
-      </w:r>
-      <w:r>
-        <w:rPr>
-          <w:rFonts w:ascii="Calibri" w:hAnsi="Calibri"/>
-          <w:b/>
-          <w:sz w:val="22"/>
-        </w:rPr>
-        <w:t>React</w:t>
-      </w:r>
-      <w:r>
-        <w:rPr>
-          <w:rFonts w:ascii="Calibri" w:hAnsi="Calibri"/>
-          <w:sz w:val="22"/>
-        </w:rPr>
-        <w:t xml:space="preserve"> y </w:t>
-      </w:r>
-      <w:r>
-        <w:rPr>
-          <w:rFonts w:ascii="Calibri" w:hAnsi="Calibri"/>
-          <w:b/>
-          <w:sz w:val="22"/>
-        </w:rPr>
-        <w:t>TypeScript</w:t>
-      </w:r>
-      <w:r>
-        <w:rPr>
-          <w:rFonts w:ascii="Calibri" w:hAnsi="Calibri"/>
-          <w:sz w:val="22"/>
-        </w:rPr>
-        <w:t>, asegurando una experiencia de usuario fluida y alta mantenibilidad del código.</w:t>
-      </w:r>
-    </w:p>
-    <w:p>
-      <w:pPr>
-        <w:pStyle w:val="ListBullet"/>
-        <w:spacing w:before="0" w:after="40"/>
-        <w:ind w:left="340"/>
-      </w:pPr>
-      <w:r>
-        <w:rPr>
-          <w:rFonts w:ascii="Calibri" w:hAnsi="Calibri"/>
-          <w:sz w:val="22"/>
-        </w:rPr>
-        <w:t>Interfaz responsiva con sistema de componentes reutilizables (PageHeader, KpiCard, IconActionButton, etc.) e identidad visual coherente en todos los módulos.</w:t>
+        <w:t>Plataforma de administración desarrollada con React y TypeScript, asegurando una experiencia de usuario fluida y alta mantenibilidad del código.</w:t>
+      </w:r>
+    </w:p>
+    <w:p>
+      <w:pPr>
+        <w:pStyle w:val="ListBullet"/>
+        <w:spacing w:before="0" w:after="40"/>
+        <w:ind w:left="340"/>
+      </w:pPr>
+      <w:r>
+        <w:rPr>
+          <w:rFonts w:ascii="Calibri" w:hAnsi="Calibri"/>
+          <w:sz w:val="22"/>
+        </w:rPr>
+        <w:t>Interfaz responsiva con sistema de componentes reutilizables e identidad visual coherente en todos los módulos.</w:t>
       </w:r>
     </w:p>
     <w:p>
@@ -6282,111 +5634,21 @@
           <w:rFonts w:ascii="Calibri" w:hAnsi="Calibri"/>
           <w:sz w:val="22"/>
         </w:rPr>
-        <w:t xml:space="preserve">Motor </w:t>
-      </w:r>
-      <w:r>
-        <w:rPr>
-          <w:rFonts w:ascii="Calibri" w:hAnsi="Calibri"/>
-          <w:b/>
-          <w:sz w:val="22"/>
-        </w:rPr>
-        <w:t>PostgreSQL</w:t>
-      </w:r>
-      <w:r>
-        <w:rPr>
-          <w:rFonts w:ascii="Calibri" w:hAnsi="Calibri"/>
-          <w:sz w:val="22"/>
-        </w:rPr>
-        <w:t xml:space="preserve"> gestionado en infraestructura Supabase, con respaldos automáticos diarios y replicación de alta disponibilidad.</w:t>
-      </w:r>
-    </w:p>
-    <w:p>
-      <w:pPr>
-        <w:pStyle w:val="ListBullet"/>
-        <w:spacing w:before="0" w:after="40"/>
-        <w:ind w:left="340"/>
-      </w:pPr>
-      <w:r>
-        <w:rPr>
-          <w:rFonts w:ascii="Calibri" w:hAnsi="Calibri"/>
-          <w:sz w:val="22"/>
-        </w:rPr>
-        <w:t xml:space="preserve">Modelo de datos relacional normalizado, organizado en schemas funcionales: </w:t>
-      </w:r>
-      <w:r>
-        <w:rPr>
-          <w:rFonts w:ascii="Calibri" w:hAnsi="Calibri"/>
-          <w:b/>
-          <w:sz w:val="22"/>
-        </w:rPr>
-        <w:t>core</w:t>
-      </w:r>
-      <w:r>
-        <w:rPr>
-          <w:rFonts w:ascii="Calibri" w:hAnsi="Calibri"/>
-          <w:sz w:val="22"/>
-        </w:rPr>
-        <w:t xml:space="preserve"> (participantes, eventos, delegaciones), </w:t>
-      </w:r>
-      <w:r>
-        <w:rPr>
-          <w:rFonts w:ascii="Calibri" w:hAnsi="Calibri"/>
-          <w:b/>
-          <w:sz w:val="22"/>
-        </w:rPr>
-        <w:t>transport</w:t>
-      </w:r>
-      <w:r>
-        <w:rPr>
-          <w:rFonts w:ascii="Calibri" w:hAnsi="Calibri"/>
-          <w:sz w:val="22"/>
-        </w:rPr>
-        <w:t xml:space="preserve"> (viajes, vehículos, tarifas), </w:t>
-      </w:r>
-      <w:r>
-        <w:rPr>
-          <w:rFonts w:ascii="Calibri" w:hAnsi="Calibri"/>
-          <w:b/>
-          <w:sz w:val="22"/>
-        </w:rPr>
-        <w:t>logistics</w:t>
-      </w:r>
-      <w:r>
-        <w:rPr>
-          <w:rFonts w:ascii="Calibri" w:hAnsi="Calibri"/>
-          <w:sz w:val="22"/>
-        </w:rPr>
-        <w:t xml:space="preserve"> (alimentación, hospedaje), </w:t>
-      </w:r>
-      <w:r>
-        <w:rPr>
-          <w:rFonts w:ascii="Calibri" w:hAnsi="Calibri"/>
-          <w:b/>
-          <w:sz w:val="22"/>
-        </w:rPr>
-        <w:t>telemetry</w:t>
-      </w:r>
-      <w:r>
-        <w:rPr>
-          <w:rFonts w:ascii="Calibri" w:hAnsi="Calibri"/>
-          <w:sz w:val="22"/>
-        </w:rPr>
-        <w:t xml:space="preserve"> (posiciones GPS), </w:t>
-      </w:r>
-      <w:r>
-        <w:rPr>
-          <w:rFonts w:ascii="Calibri" w:hAnsi="Calibri"/>
-          <w:b/>
-          <w:sz w:val="22"/>
-        </w:rPr>
-        <w:t>public</w:t>
-      </w:r>
-      <w:r>
-        <w:rPr>
-          <w:rFonts w:ascii="Calibri" w:hAnsi="Calibri"/>
-          <w:sz w:val="22"/>
-        </w:rPr>
-        <w:t xml:space="preserve"> (auth, configuraciones).</w:t>
+        <w:t>Motor PostgreSQL gestionado en infraestructura cloud, con respaldos automáticos diarios y replicación de alta disponibilidad.</w:t>
+      </w:r>
+    </w:p>
+    <w:p>
+      <w:pPr>
+        <w:pStyle w:val="ListBullet"/>
+        <w:spacing w:before="0" w:after="40"/>
+        <w:ind w:left="340"/>
+      </w:pPr>
+      <w:r>
+        <w:rPr>
+          <w:rFonts w:ascii="Calibri" w:hAnsi="Calibri"/>
+          <w:sz w:val="22"/>
+        </w:rPr>
+        <w:t>Modelo de datos relacional normalizado, organizado en esquemas funcionales por área (participantes y eventos, transporte, logística y alimentación, telemetría, configuración y autenticación).</w:t>
       </w:r>
     </w:p>
     <w:p>
@@ -6441,64 +5703,49 @@
           <w:rFonts w:ascii="Calibri" w:hAnsi="Calibri"/>
           <w:sz w:val="22"/>
         </w:rPr>
-        <w:t>Autenticación centralizada con Supabase Auth, gestión de sesiones JWT, recuperación de contraseña y soporte para mecanismos de doble factor.</w:t>
-      </w:r>
-    </w:p>
-    <w:p>
-      <w:pPr>
-        <w:pStyle w:val="ListBullet"/>
-        <w:spacing w:before="0" w:after="40"/>
-        <w:ind w:left="340"/>
-      </w:pPr>
-      <w:r>
-        <w:rPr>
-          <w:rFonts w:ascii="Calibri" w:hAnsi="Calibri"/>
-          <w:sz w:val="22"/>
-        </w:rPr>
-        <w:t xml:space="preserve">Cifrado de las comunicaciones mediante </w:t>
-      </w:r>
-      <w:r>
-        <w:rPr>
-          <w:rFonts w:ascii="Calibri" w:hAnsi="Calibri"/>
-          <w:b/>
-          <w:sz w:val="22"/>
-        </w:rPr>
-        <w:t>HTTPS/TLS</w:t>
-      </w:r>
-      <w:r>
-        <w:rPr>
-          <w:rFonts w:ascii="Calibri" w:hAnsi="Calibri"/>
-          <w:sz w:val="22"/>
-        </w:rPr>
-        <w:t xml:space="preserve"> en todos los puntos de acceso.</w:t>
-      </w:r>
-    </w:p>
-    <w:p>
-      <w:pPr>
-        <w:pStyle w:val="ListBullet"/>
-        <w:spacing w:before="0" w:after="40"/>
-        <w:ind w:left="340"/>
-      </w:pPr>
-      <w:r>
-        <w:rPr>
-          <w:rFonts w:ascii="Calibri" w:hAnsi="Calibri"/>
-          <w:sz w:val="22"/>
-        </w:rPr>
-        <w:t>Almacenamiento de archivos sensibles (documentos, fotografías) en repositorios privados de Supabase Storage con políticas de acceso por rol (Row Level Security).</w:t>
-      </w:r>
-    </w:p>
-    <w:p>
-      <w:pPr>
-        <w:pStyle w:val="ListBullet"/>
-        <w:spacing w:before="0" w:after="40"/>
-        <w:ind w:left="340"/>
-      </w:pPr>
-      <w:r>
-        <w:rPr>
-          <w:rFonts w:ascii="Calibri" w:hAnsi="Calibri"/>
-          <w:sz w:val="22"/>
-        </w:rPr>
-        <w:t>Registro de auditoría de las acciones relevantes ejecutadas en la plataforma (incluye las ejecutadas por el asistente SofIA, ver sección 28).</w:t>
+        <w:t>Autenticación centralizada con gestión de sesiones, recuperación de contraseña y soporte para mecanismos de doble factor.</w:t>
+      </w:r>
+    </w:p>
+    <w:p>
+      <w:pPr>
+        <w:pStyle w:val="ListBullet"/>
+        <w:spacing w:before="0" w:after="40"/>
+        <w:ind w:left="340"/>
+      </w:pPr>
+      <w:r>
+        <w:rPr>
+          <w:rFonts w:ascii="Calibri" w:hAnsi="Calibri"/>
+          <w:sz w:val="22"/>
+        </w:rPr>
+        <w:t>Cifrado de las comunicaciones mediante HTTPS/TLS en todos los puntos de acceso.</w:t>
+      </w:r>
+    </w:p>
+    <w:p>
+      <w:pPr>
+        <w:pStyle w:val="ListBullet"/>
+        <w:spacing w:before="0" w:after="40"/>
+        <w:ind w:left="340"/>
+      </w:pPr>
+      <w:r>
+        <w:rPr>
+          <w:rFonts w:ascii="Calibri" w:hAnsi="Calibri"/>
+          <w:sz w:val="22"/>
+        </w:rPr>
+        <w:t>Almacenamiento de archivos sensibles (documentos, fotografías) en repositorios privados con políticas de acceso por rol.</w:t>
+      </w:r>
+    </w:p>
+    <w:p>
+      <w:pPr>
+        <w:pStyle w:val="ListBullet"/>
+        <w:spacing w:before="0" w:after="40"/>
+        <w:ind w:left="340"/>
+      </w:pPr>
+      <w:r>
+        <w:rPr>
+          <w:rFonts w:ascii="Calibri" w:hAnsi="Calibri"/>
+          <w:sz w:val="22"/>
+        </w:rPr>
+        <w:t>Registro de auditoría de las acciones relevantes ejecutadas en la plataforma, incluyendo las operaciones realizadas por el asistente de inteligencia artificial (ver sección 28).</w:t>
       </w:r>
     </w:p>
     <w:p>
@@ -6608,22 +5855,7 @@
           <w:rFonts w:ascii="Calibri" w:hAnsi="Calibri"/>
           <w:sz w:val="22"/>
         </w:rPr>
-        <w:t xml:space="preserve">La plataforma integra un </w:t>
-      </w:r>
-      <w:r>
-        <w:rPr>
-          <w:rFonts w:ascii="Calibri" w:hAnsi="Calibri"/>
-          <w:b/>
-          <w:sz w:val="22"/>
-        </w:rPr>
-        <w:t>asistente conversacional basado en modelos avanzados de Inteligencia Artificial</w:t>
-      </w:r>
-      <w:r>
-        <w:rPr>
-          <w:rFonts w:ascii="Calibri" w:hAnsi="Calibri"/>
-          <w:sz w:val="22"/>
-        </w:rPr>
-        <w:t xml:space="preserve"> (SofIA), que permite a los usuarios administradores consultar información operativa en lenguaje natural y ejecutar acciones controladas.</w:t>
+        <w:t>La plataforma integra un asistente conversacional basado en modelos avanzados de Inteligencia Artificial (SofIA), que permite a los usuarios administradores consultar información operativa en lenguaje natural y ejecutar acciones controladas.</w:t>
       </w:r>
     </w:p>
     <w:p>
@@ -6649,39 +5881,23 @@
       <w:r>
         <w:rPr>
           <w:rFonts w:ascii="Calibri" w:hAnsi="Calibri"/>
-          <w:b/>
-          <w:sz w:val="22"/>
-        </w:rPr>
-        <w:t>Mapa de Google Maps embebido</w:t>
-      </w:r>
-      <w:r>
-        <w:rPr>
-          <w:rFonts w:ascii="Calibri" w:hAnsi="Calibri"/>
-          <w:sz w:val="22"/>
-        </w:rPr>
-        <w:t xml:space="preserve"> en el widget del asistente para visualizar conductores y viajes consultados, sin salir de la conversación.</w:t>
-      </w:r>
-    </w:p>
-    <w:p>
-      <w:pPr>
-        <w:pStyle w:val="ListBullet"/>
-        <w:spacing w:before="0" w:after="40"/>
-        <w:ind w:left="340"/>
-      </w:pPr>
-      <w:r>
-        <w:rPr>
-          <w:rFonts w:ascii="Calibri" w:hAnsi="Calibri"/>
-          <w:b/>
-          <w:sz w:val="22"/>
-        </w:rPr>
-        <w:t>Mensajes de progreso personalizados</w:t>
-      </w:r>
-      <w:r>
-        <w:rPr>
-          <w:rFonts w:ascii="Calibri" w:hAnsi="Calibri"/>
-          <w:sz w:val="22"/>
-        </w:rPr>
-        <w:t xml:space="preserve"> en español por herramienta (≈53 etiquetas mapeadas) en lugar de etiquetas técnicas de bajo nivel.</w:t>
+          <w:sz w:val="22"/>
+        </w:rPr>
+        <w:t>Mapa interactivo embebido en la conversación con el asistente, para visualizar la posición de los conductores y los viajes consultados sin salir del chat.</w:t>
+      </w:r>
+    </w:p>
+    <w:p>
+      <w:pPr>
+        <w:pStyle w:val="ListBullet"/>
+        <w:spacing w:before="0" w:after="40"/>
+        <w:ind w:left="340"/>
+      </w:pPr>
+      <w:r>
+        <w:rPr>
+          <w:rFonts w:ascii="Calibri" w:hAnsi="Calibri"/>
+          <w:sz w:val="22"/>
+        </w:rPr>
+        <w:t>Mensajes de progreso personalizados en español durante la ejecución de cada operación del asistente, en lugar de etiquetas técnicas.</w:t>
       </w:r>
     </w:p>
     <w:p>
@@ -6721,17 +5937,9 @@
       <w:r>
         <w:rPr>
           <w:rFonts w:ascii="Calibri" w:hAnsi="Calibri"/>
-          <w:b/>
-          <w:sz w:val="22"/>
-        </w:rPr>
-        <w:t>Auditoría completa</w:t>
-      </w:r>
-      <w:r>
-        <w:rPr>
-          <w:rFonts w:ascii="Calibri" w:hAnsi="Calibri"/>
-          <w:sz w:val="22"/>
-        </w:rPr>
-        <w:t xml:space="preserve"> de las acciones ejecutadas por el asistente (ver sección 28).</w:t>
+          <w:sz w:val="22"/>
+        </w:rPr>
+        <w:t>Auditoría completa de las operaciones ejecutadas por el asistente, descrita en la sección 28.</w:t>
       </w:r>
     </w:p>
     <w:p>
@@ -8054,7 +7262,7 @@
           <w:rFonts w:ascii="Calibri" w:hAnsi="Calibri"/>
           <w:sz w:val="22"/>
         </w:rPr>
-        <w:t xml:space="preserve"> con foto de perfil y datos personales (modal inline).</w:t>
+        <w:t xml:space="preserve"> con foto de perfil y datos personales, accesible dentro de la propia aplicación sin necesidad de abrir una ventana adicional.</w:t>
       </w:r>
     </w:p>
     <w:p>
@@ -8308,7 +7516,7 @@
           <w:rFonts w:ascii="Calibri" w:hAnsi="Calibri"/>
           <w:sz w:val="22"/>
         </w:rPr>
-        <w:t xml:space="preserve"> para acreditación de ingreso a sedes, hoteles y alimentación (modal inline).</w:t>
+        <w:t xml:space="preserve"> para acreditación de ingreso a sedes, hoteles y alimentación, accesible dentro de la propia aplicación sin necesidad de abrir una ventana adicional.</w:t>
       </w:r>
     </w:p>
     <w:p>

</xml_diff>